<commit_message>
simple change in ER diagram
</commit_message>
<xml_diff>
--- a/ER_diagram/OlympicInsightPro_ERdiagram.docx
+++ b/ER_diagram/OlympicInsightPro_ERdiagram.docx
@@ -69,85 +69,7 @@
         <mc:AlternateContent>
           <mc:Choice Requires="wps">
             <w:drawing>
-              <wp:anchor distT="0" distB="0" distL="114300" distR="114300" simplePos="0" relativeHeight="251891712" behindDoc="0" locked="0" layoutInCell="1" allowOverlap="1" wp14:anchorId="72822F3F" wp14:editId="7AE1371C">
-                <wp:simplePos x="0" y="0"/>
-                <wp:positionH relativeFrom="column">
-                  <wp:posOffset>4114800</wp:posOffset>
-                </wp:positionH>
-                <wp:positionV relativeFrom="paragraph">
-                  <wp:posOffset>2583180</wp:posOffset>
-                </wp:positionV>
-                <wp:extent cx="76200" cy="205740"/>
-                <wp:effectExtent l="9525" t="9525" r="9525" b="13335"/>
-                <wp:wrapNone/>
-                <wp:docPr id="1708315212" name="AutoShape 55"/>
-                <wp:cNvGraphicFramePr>
-                  <a:graphicFrameLocks xmlns:a="http://schemas.openxmlformats.org/drawingml/2006/main"/>
-                </wp:cNvGraphicFramePr>
-                <a:graphic xmlns:a="http://schemas.openxmlformats.org/drawingml/2006/main">
-                  <a:graphicData uri="http://schemas.microsoft.com/office/word/2010/wordprocessingShape">
-                    <wps:wsp>
-                      <wps:cNvCnPr>
-                        <a:cxnSpLocks noChangeShapeType="1"/>
-                      </wps:cNvCnPr>
-                      <wps:spPr bwMode="auto">
-                        <a:xfrm>
-                          <a:off x="0" y="0"/>
-                          <a:ext cx="76200" cy="205740"/>
-                        </a:xfrm>
-                        <a:prstGeom prst="straightConnector1">
-                          <a:avLst/>
-                        </a:prstGeom>
-                        <a:noFill/>
-                        <a:ln w="9525">
-                          <a:solidFill>
-                            <a:srgbClr val="000000"/>
-                          </a:solidFill>
-                          <a:round/>
-                          <a:headEnd type="none" w="med" len="med"/>
-                          <a:tailEnd type="none" w="med" len="med"/>
-                        </a:ln>
-                        <a:extLst>
-                          <a:ext uri="{909E8E84-426E-40DD-AFC4-6F175D3DCCD1}">
-                            <a14:hiddenFill xmlns:a14="http://schemas.microsoft.com/office/drawing/2010/main">
-                              <a:noFill/>
-                            </a14:hiddenFill>
-                          </a:ext>
-                        </a:extLst>
-                      </wps:spPr>
-                      <wps:bodyPr/>
-                    </wps:wsp>
-                  </a:graphicData>
-                </a:graphic>
-                <wp14:sizeRelH relativeFrom="page">
-                  <wp14:pctWidth>0</wp14:pctWidth>
-                </wp14:sizeRelH>
-                <wp14:sizeRelV relativeFrom="page">
-                  <wp14:pctHeight>0</wp14:pctHeight>
-                </wp14:sizeRelV>
-              </wp:anchor>
-            </w:drawing>
-          </mc:Choice>
-          <mc:Fallback>
-            <w:pict>
-              <v:shapetype w14:anchorId="1610D967" id="_x0000_t32" coordsize="21600,21600" o:spt="32" o:oned="t" path="m,l21600,21600e" filled="f">
-                <v:path arrowok="t" fillok="f" o:connecttype="none"/>
-                <o:lock v:ext="edit" shapetype="t"/>
-              </v:shapetype>
-              <v:shape id="AutoShape 55" o:spid="_x0000_s1026" type="#_x0000_t32" style="position:absolute;margin-left:324pt;margin-top:203.4pt;width:6pt;height:16.2pt;z-index:251891712;visibility:visible;mso-wrap-style:square;mso-width-percent:0;mso-height-percent:0;mso-wrap-distance-left:9pt;mso-wrap-distance-top:0;mso-wrap-distance-right:9pt;mso-wrap-distance-bottom:0;mso-position-horizontal:absolute;mso-position-horizontal-relative:text;mso-position-vertical:absolute;mso-position-vertical-relative:text;mso-width-percent:0;mso-height-percent:0;mso-width-relative:page;mso-height-relative:page" o:gfxdata="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"/>
-            </w:pict>
-          </mc:Fallback>
-        </mc:AlternateContent>
-      </w:r>
-      <w:r>
-        <w:rPr>
-          <w:noProof/>
-          <w:color w:val="FFFFFF" w:themeColor="background1"/>
-        </w:rPr>
-        <mc:AlternateContent>
-          <mc:Choice Requires="wps">
-            <w:drawing>
-              <wp:anchor distT="0" distB="0" distL="114300" distR="114300" simplePos="0" relativeHeight="251455488" behindDoc="0" locked="0" layoutInCell="1" allowOverlap="1" wp14:anchorId="1FA65CF9" wp14:editId="06B42C50">
+              <wp:anchor distT="0" distB="0" distL="114300" distR="114300" simplePos="0" relativeHeight="251678720" behindDoc="0" locked="0" layoutInCell="1" allowOverlap="1" wp14:anchorId="1FA65CF9" wp14:editId="1C589846">
                 <wp:simplePos x="0" y="0"/>
                 <wp:positionH relativeFrom="column">
                   <wp:posOffset>2820035</wp:posOffset>
@@ -226,7 +148,7 @@
           </mc:Choice>
           <mc:Fallback>
             <w:pict>
-              <v:oval w14:anchorId="1FA65CF9" id="Oval 29" o:spid="_x0000_s1026" style="position:absolute;margin-left:222.05pt;margin-top:209.4pt;width:115.15pt;height:30.6pt;z-index:251455488;visibility:visible;mso-wrap-style:square;mso-width-percent:0;mso-height-percent:0;mso-wrap-distance-left:9pt;mso-wrap-distance-top:0;mso-wrap-distance-right:9pt;mso-wrap-distance-bottom:0;mso-position-horizontal:absolute;mso-position-horizontal-relative:text;mso-position-vertical:absolute;mso-position-vertical-relative:text;mso-width-percent:0;mso-height-percent:0;mso-width-relative:page;mso-height-relative:page;v-text-anchor:top" o:gfxdata="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">
+              <v:oval w14:anchorId="1FA65CF9" id="Oval 29" o:spid="_x0000_s1026" style="position:absolute;margin-left:222.05pt;margin-top:209.4pt;width:115.15pt;height:30.6pt;z-index:251678720;visibility:visible;mso-wrap-style:square;mso-width-percent:0;mso-height-percent:0;mso-wrap-distance-left:9pt;mso-wrap-distance-top:0;mso-wrap-distance-right:9pt;mso-wrap-distance-bottom:0;mso-position-horizontal:absolute;mso-position-horizontal-relative:text;mso-position-vertical:absolute;mso-position-vertical-relative:text;mso-width-percent:0;mso-height-percent:0;mso-width-relative:page;mso-height-relative:page;v-text-anchor:top" o:gfxdata="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">
                 <v:textbox>
                   <w:txbxContent>
                     <w:p>
@@ -261,7 +183,7 @@
         <mc:AlternateContent>
           <mc:Choice Requires="wps">
             <w:drawing>
-              <wp:anchor distT="0" distB="0" distL="114300" distR="114300" simplePos="0" relativeHeight="251418624" behindDoc="0" locked="0" layoutInCell="1" allowOverlap="1" wp14:anchorId="1FA65CF9" wp14:editId="6C8C0530">
+              <wp:anchor distT="0" distB="0" distL="114300" distR="114300" simplePos="0" relativeHeight="251676672" behindDoc="0" locked="0" layoutInCell="1" allowOverlap="1" wp14:anchorId="1FA65CF9" wp14:editId="6C8C0530">
                 <wp:simplePos x="0" y="0"/>
                 <wp:positionH relativeFrom="column">
                   <wp:posOffset>4250055</wp:posOffset>
@@ -354,7 +276,7 @@
           </mc:Choice>
           <mc:Fallback>
             <w:pict>
-              <v:oval w14:anchorId="1FA65CF9" id="Oval 27" o:spid="_x0000_s1027" style="position:absolute;margin-left:334.65pt;margin-top:48pt;width:79.15pt;height:30pt;z-index:251418624;visibility:visible;mso-wrap-style:square;mso-width-percent:0;mso-height-percent:0;mso-wrap-distance-left:9pt;mso-wrap-distance-top:0;mso-wrap-distance-right:9pt;mso-wrap-distance-bottom:0;mso-position-horizontal:absolute;mso-position-horizontal-relative:text;mso-position-vertical:absolute;mso-position-vertical-relative:text;mso-width-percent:0;mso-height-percent:0;mso-width-relative:page;mso-height-relative:page;v-text-anchor:top" o:gfxdata="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">
+              <v:oval w14:anchorId="1FA65CF9" id="Oval 27" o:spid="_x0000_s1027" style="position:absolute;margin-left:334.65pt;margin-top:48pt;width:79.15pt;height:30pt;z-index:251676672;visibility:visible;mso-wrap-style:square;mso-width-percent:0;mso-height-percent:0;mso-wrap-distance-left:9pt;mso-wrap-distance-top:0;mso-wrap-distance-right:9pt;mso-wrap-distance-bottom:0;mso-position-horizontal:absolute;mso-position-horizontal-relative:text;mso-position-vertical:absolute;mso-position-vertical-relative:text;mso-width-percent:0;mso-height-percent:0;mso-width-relative:page;mso-height-relative:page;v-text-anchor:top" o:gfxdata="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">
                 <v:textbox>
                   <w:txbxContent>
                     <w:p>
@@ -403,7 +325,7 @@
         <mc:AlternateContent>
           <mc:Choice Requires="wps">
             <w:drawing>
-              <wp:anchor distT="0" distB="0" distL="114300" distR="114300" simplePos="0" relativeHeight="251308032" behindDoc="0" locked="0" layoutInCell="1" allowOverlap="1" wp14:anchorId="1FA65CF9" wp14:editId="4581E7BC">
+              <wp:anchor distT="0" distB="0" distL="114300" distR="114300" simplePos="0" relativeHeight="251663360" behindDoc="0" locked="0" layoutInCell="1" allowOverlap="1" wp14:anchorId="1FA65CF9" wp14:editId="4581E7BC">
                 <wp:simplePos x="0" y="0"/>
                 <wp:positionH relativeFrom="column">
                   <wp:posOffset>-281305</wp:posOffset>
@@ -482,7 +404,7 @@
           </mc:Choice>
           <mc:Fallback>
             <w:pict>
-              <v:oval w14:anchorId="1FA65CF9" id="Oval 8" o:spid="_x0000_s1028" style="position:absolute;margin-left:-22.15pt;margin-top:34.2pt;width:78.55pt;height:34.2pt;z-index:251308032;visibility:visible;mso-wrap-style:square;mso-width-percent:0;mso-height-percent:0;mso-wrap-distance-left:9pt;mso-wrap-distance-top:0;mso-wrap-distance-right:9pt;mso-wrap-distance-bottom:0;mso-position-horizontal:absolute;mso-position-horizontal-relative:text;mso-position-vertical:absolute;mso-position-vertical-relative:text;mso-width-percent:0;mso-height-percent:0;mso-width-relative:page;mso-height-relative:page;v-text-anchor:top" o:gfxdata="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">
+              <v:oval w14:anchorId="1FA65CF9" id="Oval 8" o:spid="_x0000_s1028" style="position:absolute;margin-left:-22.15pt;margin-top:34.2pt;width:78.55pt;height:34.2pt;z-index:251663360;visibility:visible;mso-wrap-style:square;mso-width-percent:0;mso-height-percent:0;mso-wrap-distance-left:9pt;mso-wrap-distance-top:0;mso-wrap-distance-right:9pt;mso-wrap-distance-bottom:0;mso-position-horizontal:absolute;mso-position-horizontal-relative:text;mso-position-vertical:absolute;mso-position-vertical-relative:text;mso-width-percent:0;mso-height-percent:0;mso-width-relative:page;mso-height-relative:page;v-text-anchor:top" o:gfxdata="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">
                 <v:textbox>
                   <w:txbxContent>
                     <w:p>
@@ -517,7 +439,7 @@
         <mc:AlternateContent>
           <mc:Choice Requires="wps">
             <w:drawing>
-              <wp:anchor distT="0" distB="0" distL="114300" distR="114300" simplePos="0" relativeHeight="252186624" behindDoc="0" locked="0" layoutInCell="1" allowOverlap="1" wp14:anchorId="540E51F6" wp14:editId="38EE3830">
+              <wp:anchor distT="0" distB="0" distL="114300" distR="114300" simplePos="0" relativeHeight="251718656" behindDoc="0" locked="0" layoutInCell="1" allowOverlap="1" wp14:anchorId="540E51F6" wp14:editId="38EE3830">
                 <wp:simplePos x="0" y="0"/>
                 <wp:positionH relativeFrom="column">
                   <wp:posOffset>6309360</wp:posOffset>
@@ -578,7 +500,11 @@
           </mc:Choice>
           <mc:Fallback>
             <w:pict>
-              <v:shape w14:anchorId="7F562DF4" id="AutoShape 71" o:spid="_x0000_s1026" type="#_x0000_t32" style="position:absolute;margin-left:496.8pt;margin-top:441pt;width:3pt;height:56.4pt;flip:x y;z-index:252186624;visibility:visible;mso-wrap-style:square;mso-width-percent:0;mso-height-percent:0;mso-wrap-distance-left:9pt;mso-wrap-distance-top:0;mso-wrap-distance-right:9pt;mso-wrap-distance-bottom:0;mso-position-horizontal:absolute;mso-position-horizontal-relative:text;mso-position-vertical:absolute;mso-position-vertical-relative:text;mso-width-percent:0;mso-height-percent:0;mso-width-relative:page;mso-height-relative:page" o:gfxdata="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"/>
+              <v:shapetype w14:anchorId="0F3CD23B" id="_x0000_t32" coordsize="21600,21600" o:spt="32" o:oned="t" path="m,l21600,21600e" filled="f">
+                <v:path arrowok="t" fillok="f" o:connecttype="none"/>
+                <o:lock v:ext="edit" shapetype="t"/>
+              </v:shapetype>
+              <v:shape id="AutoShape 71" o:spid="_x0000_s1026" type="#_x0000_t32" style="position:absolute;margin-left:496.8pt;margin-top:441pt;width:3pt;height:56.4pt;flip:x y;z-index:251718656;visibility:visible;mso-wrap-style:square;mso-width-percent:0;mso-height-percent:0;mso-wrap-distance-left:9pt;mso-wrap-distance-top:0;mso-wrap-distance-right:9pt;mso-wrap-distance-bottom:0;mso-position-horizontal:absolute;mso-position-horizontal-relative:text;mso-position-vertical:absolute;mso-position-vertical-relative:text;mso-width-percent:0;mso-height-percent:0;mso-width-relative:page;mso-height-relative:page" o:gfxdata="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"/>
             </w:pict>
           </mc:Fallback>
         </mc:AlternateContent>
@@ -591,7 +517,7 @@
         <mc:AlternateContent>
           <mc:Choice Requires="wps">
             <w:drawing>
-              <wp:anchor distT="0" distB="0" distL="114300" distR="114300" simplePos="0" relativeHeight="252168192" behindDoc="0" locked="0" layoutInCell="1" allowOverlap="1" wp14:anchorId="7C173314" wp14:editId="7812183A">
+              <wp:anchor distT="0" distB="0" distL="114300" distR="114300" simplePos="0" relativeHeight="251717632" behindDoc="0" locked="0" layoutInCell="1" allowOverlap="1" wp14:anchorId="7C173314" wp14:editId="7812183A">
                 <wp:simplePos x="0" y="0"/>
                 <wp:positionH relativeFrom="column">
                   <wp:posOffset>5463540</wp:posOffset>
@@ -652,7 +578,7 @@
           </mc:Choice>
           <mc:Fallback>
             <w:pict>
-              <v:shape w14:anchorId="6AF303B6" id="AutoShape 70" o:spid="_x0000_s1026" type="#_x0000_t32" style="position:absolute;margin-left:430.2pt;margin-top:441.95pt;width:7.8pt;height:25.45pt;flip:y;z-index:252168192;visibility:visible;mso-wrap-style:square;mso-width-percent:0;mso-height-percent:0;mso-wrap-distance-left:9pt;mso-wrap-distance-top:0;mso-wrap-distance-right:9pt;mso-wrap-distance-bottom:0;mso-position-horizontal:absolute;mso-position-horizontal-relative:text;mso-position-vertical:absolute;mso-position-vertical-relative:text;mso-width-percent:0;mso-height-percent:0;mso-width-relative:page;mso-height-relative:page" o:gfxdata="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"/>
+              <v:shape w14:anchorId="5B55E619" id="AutoShape 70" o:spid="_x0000_s1026" type="#_x0000_t32" style="position:absolute;margin-left:430.2pt;margin-top:441.95pt;width:7.8pt;height:25.45pt;flip:y;z-index:251717632;visibility:visible;mso-wrap-style:square;mso-width-percent:0;mso-height-percent:0;mso-wrap-distance-left:9pt;mso-wrap-distance-top:0;mso-wrap-distance-right:9pt;mso-wrap-distance-bottom:0;mso-position-horizontal:absolute;mso-position-horizontal-relative:text;mso-position-vertical:absolute;mso-position-vertical-relative:text;mso-width-percent:0;mso-height-percent:0;mso-width-relative:page;mso-height-relative:page" o:gfxdata="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"/>
             </w:pict>
           </mc:Fallback>
         </mc:AlternateContent>
@@ -665,7 +591,7 @@
         <mc:AlternateContent>
           <mc:Choice Requires="wps">
             <w:drawing>
-              <wp:anchor distT="0" distB="0" distL="114300" distR="114300" simplePos="0" relativeHeight="252149760" behindDoc="0" locked="0" layoutInCell="1" allowOverlap="1" wp14:anchorId="40B50370" wp14:editId="0848F1AA">
+              <wp:anchor distT="0" distB="0" distL="114300" distR="114300" simplePos="0" relativeHeight="251716608" behindDoc="0" locked="0" layoutInCell="1" allowOverlap="1" wp14:anchorId="40B50370" wp14:editId="0848F1AA">
                 <wp:simplePos x="0" y="0"/>
                 <wp:positionH relativeFrom="column">
                   <wp:posOffset>4564380</wp:posOffset>
@@ -726,7 +652,7 @@
           </mc:Choice>
           <mc:Fallback>
             <w:pict>
-              <v:shape w14:anchorId="7BD20A37" id="AutoShape 69" o:spid="_x0000_s1026" type="#_x0000_t32" style="position:absolute;margin-left:359.4pt;margin-top:440.4pt;width:42pt;height:58.2pt;flip:y;z-index:252149760;visibility:visible;mso-wrap-style:square;mso-width-percent:0;mso-height-percent:0;mso-wrap-distance-left:9pt;mso-wrap-distance-top:0;mso-wrap-distance-right:9pt;mso-wrap-distance-bottom:0;mso-position-horizontal:absolute;mso-position-horizontal-relative:text;mso-position-vertical:absolute;mso-position-vertical-relative:text;mso-width-percent:0;mso-height-percent:0;mso-width-relative:page;mso-height-relative:page" o:gfxdata="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"/>
+              <v:shape w14:anchorId="6FC13507" id="AutoShape 69" o:spid="_x0000_s1026" type="#_x0000_t32" style="position:absolute;margin-left:359.4pt;margin-top:440.4pt;width:42pt;height:58.2pt;flip:y;z-index:251716608;visibility:visible;mso-wrap-style:square;mso-width-percent:0;mso-height-percent:0;mso-wrap-distance-left:9pt;mso-wrap-distance-top:0;mso-wrap-distance-right:9pt;mso-wrap-distance-bottom:0;mso-position-horizontal:absolute;mso-position-horizontal-relative:text;mso-position-vertical:absolute;mso-position-vertical-relative:text;mso-width-percent:0;mso-height-percent:0;mso-width-relative:page;mso-height-relative:page" o:gfxdata="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"/>
             </w:pict>
           </mc:Fallback>
         </mc:AlternateContent>
@@ -739,7 +665,7 @@
         <mc:AlternateContent>
           <mc:Choice Requires="wps">
             <w:drawing>
-              <wp:anchor distT="0" distB="0" distL="114300" distR="114300" simplePos="0" relativeHeight="252131328" behindDoc="0" locked="0" layoutInCell="1" allowOverlap="1" wp14:anchorId="1D01AF02" wp14:editId="10D9E1AD">
+              <wp:anchor distT="0" distB="0" distL="114300" distR="114300" simplePos="0" relativeHeight="251715584" behindDoc="0" locked="0" layoutInCell="1" allowOverlap="1" wp14:anchorId="1D01AF02" wp14:editId="10D9E1AD">
                 <wp:simplePos x="0" y="0"/>
                 <wp:positionH relativeFrom="column">
                   <wp:posOffset>4549140</wp:posOffset>
@@ -800,7 +726,7 @@
           </mc:Choice>
           <mc:Fallback>
             <w:pict>
-              <v:shape w14:anchorId="4F90677F" id="AutoShape 68" o:spid="_x0000_s1026" type="#_x0000_t32" style="position:absolute;margin-left:358.2pt;margin-top:442.8pt;width:29.4pt;height:21pt;flip:y;z-index:252131328;visibility:visible;mso-wrap-style:square;mso-width-percent:0;mso-height-percent:0;mso-wrap-distance-left:9pt;mso-wrap-distance-top:0;mso-wrap-distance-right:9pt;mso-wrap-distance-bottom:0;mso-position-horizontal:absolute;mso-position-horizontal-relative:text;mso-position-vertical:absolute;mso-position-vertical-relative:text;mso-width-percent:0;mso-height-percent:0;mso-width-relative:page;mso-height-relative:page" o:gfxdata="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"/>
+              <v:shape w14:anchorId="096F30B3" id="AutoShape 68" o:spid="_x0000_s1026" type="#_x0000_t32" style="position:absolute;margin-left:358.2pt;margin-top:442.8pt;width:29.4pt;height:21pt;flip:y;z-index:251715584;visibility:visible;mso-wrap-style:square;mso-width-percent:0;mso-height-percent:0;mso-wrap-distance-left:9pt;mso-wrap-distance-top:0;mso-wrap-distance-right:9pt;mso-wrap-distance-bottom:0;mso-position-horizontal:absolute;mso-position-horizontal-relative:text;mso-position-vertical:absolute;mso-position-vertical-relative:text;mso-width-percent:0;mso-height-percent:0;mso-width-relative:page;mso-height-relative:page" o:gfxdata="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"/>
             </w:pict>
           </mc:Fallback>
         </mc:AlternateContent>
@@ -813,7 +739,7 @@
         <mc:AlternateContent>
           <mc:Choice Requires="wps">
             <w:drawing>
-              <wp:anchor distT="0" distB="0" distL="114300" distR="114300" simplePos="0" relativeHeight="252112896" behindDoc="0" locked="0" layoutInCell="1" allowOverlap="1" wp14:anchorId="4B8D256A" wp14:editId="38EEEF40">
+              <wp:anchor distT="0" distB="0" distL="114300" distR="114300" simplePos="0" relativeHeight="251714560" behindDoc="0" locked="0" layoutInCell="1" allowOverlap="1" wp14:anchorId="4B8D256A" wp14:editId="38EEEF40">
                 <wp:simplePos x="0" y="0"/>
                 <wp:positionH relativeFrom="column">
                   <wp:posOffset>274320</wp:posOffset>
@@ -874,7 +800,7 @@
           </mc:Choice>
           <mc:Fallback>
             <w:pict>
-              <v:shape w14:anchorId="2C71D64B" id="AutoShape 67" o:spid="_x0000_s1026" type="#_x0000_t32" style="position:absolute;margin-left:21.6pt;margin-top:454.2pt;width:19.8pt;height:16.2pt;flip:y;z-index:252112896;visibility:visible;mso-wrap-style:square;mso-width-percent:0;mso-height-percent:0;mso-wrap-distance-left:9pt;mso-wrap-distance-top:0;mso-wrap-distance-right:9pt;mso-wrap-distance-bottom:0;mso-position-horizontal:absolute;mso-position-horizontal-relative:text;mso-position-vertical:absolute;mso-position-vertical-relative:text;mso-width-percent:0;mso-height-percent:0;mso-width-relative:page;mso-height-relative:page" o:gfxdata="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"/>
+              <v:shape w14:anchorId="1CA04CD3" id="AutoShape 67" o:spid="_x0000_s1026" type="#_x0000_t32" style="position:absolute;margin-left:21.6pt;margin-top:454.2pt;width:19.8pt;height:16.2pt;flip:y;z-index:251714560;visibility:visible;mso-wrap-style:square;mso-width-percent:0;mso-height-percent:0;mso-wrap-distance-left:9pt;mso-wrap-distance-top:0;mso-wrap-distance-right:9pt;mso-wrap-distance-bottom:0;mso-position-horizontal:absolute;mso-position-horizontal-relative:text;mso-position-vertical:absolute;mso-position-vertical-relative:text;mso-width-percent:0;mso-height-percent:0;mso-width-relative:page;mso-height-relative:page" o:gfxdata="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"/>
             </w:pict>
           </mc:Fallback>
         </mc:AlternateContent>
@@ -887,7 +813,7 @@
         <mc:AlternateContent>
           <mc:Choice Requires="wps">
             <w:drawing>
-              <wp:anchor distT="0" distB="0" distL="114300" distR="114300" simplePos="0" relativeHeight="252094464" behindDoc="0" locked="0" layoutInCell="1" allowOverlap="1" wp14:anchorId="5C32CA76" wp14:editId="38FB08D1">
+              <wp:anchor distT="0" distB="0" distL="114300" distR="114300" simplePos="0" relativeHeight="251713536" behindDoc="0" locked="0" layoutInCell="1" allowOverlap="1" wp14:anchorId="5C32CA76" wp14:editId="38FB08D1">
                 <wp:simplePos x="0" y="0"/>
                 <wp:positionH relativeFrom="column">
                   <wp:posOffset>297180</wp:posOffset>
@@ -948,7 +874,7 @@
           </mc:Choice>
           <mc:Fallback>
             <w:pict>
-              <v:shape w14:anchorId="12584E5C" id="AutoShape 66" o:spid="_x0000_s1026" type="#_x0000_t32" style="position:absolute;margin-left:23.4pt;margin-top:403.8pt;width:11.4pt;height:18.6pt;z-index:252094464;visibility:visible;mso-wrap-style:square;mso-width-percent:0;mso-height-percent:0;mso-wrap-distance-left:9pt;mso-wrap-distance-top:0;mso-wrap-distance-right:9pt;mso-wrap-distance-bottom:0;mso-position-horizontal:absolute;mso-position-horizontal-relative:text;mso-position-vertical:absolute;mso-position-vertical-relative:text;mso-width-percent:0;mso-height-percent:0;mso-width-relative:page;mso-height-relative:page" o:gfxdata="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"/>
+              <v:shape w14:anchorId="743EBA48" id="AutoShape 66" o:spid="_x0000_s1026" type="#_x0000_t32" style="position:absolute;margin-left:23.4pt;margin-top:403.8pt;width:11.4pt;height:18.6pt;z-index:251713536;visibility:visible;mso-wrap-style:square;mso-width-percent:0;mso-height-percent:0;mso-wrap-distance-left:9pt;mso-wrap-distance-top:0;mso-wrap-distance-right:9pt;mso-wrap-distance-bottom:0;mso-position-horizontal:absolute;mso-position-horizontal-relative:text;mso-position-vertical:absolute;mso-position-vertical-relative:text;mso-width-percent:0;mso-height-percent:0;mso-width-relative:page;mso-height-relative:page" o:gfxdata="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"/>
             </w:pict>
           </mc:Fallback>
         </mc:AlternateContent>
@@ -961,7 +887,7 @@
         <mc:AlternateContent>
           <mc:Choice Requires="wps">
             <w:drawing>
-              <wp:anchor distT="0" distB="0" distL="114300" distR="114300" simplePos="0" relativeHeight="252076032" behindDoc="0" locked="0" layoutInCell="1" allowOverlap="1" wp14:anchorId="17DD47A8" wp14:editId="7622BB95">
+              <wp:anchor distT="0" distB="0" distL="114300" distR="114300" simplePos="0" relativeHeight="251712512" behindDoc="0" locked="0" layoutInCell="1" allowOverlap="1" wp14:anchorId="17DD47A8" wp14:editId="7622BB95">
                 <wp:simplePos x="0" y="0"/>
                 <wp:positionH relativeFrom="column">
                   <wp:posOffset>2735580</wp:posOffset>
@@ -1022,7 +948,7 @@
           </mc:Choice>
           <mc:Fallback>
             <w:pict>
-              <v:shape w14:anchorId="04C90CDC" id="AutoShape 65" o:spid="_x0000_s1026" type="#_x0000_t32" style="position:absolute;margin-left:215.4pt;margin-top:319.2pt;width:11.05pt;height:65.4pt;flip:x y;z-index:252076032;visibility:visible;mso-wrap-style:square;mso-width-percent:0;mso-height-percent:0;mso-wrap-distance-left:9pt;mso-wrap-distance-top:0;mso-wrap-distance-right:9pt;mso-wrap-distance-bottom:0;mso-position-horizontal:absolute;mso-position-horizontal-relative:text;mso-position-vertical:absolute;mso-position-vertical-relative:text;mso-width-percent:0;mso-height-percent:0;mso-width-relative:page;mso-height-relative:page" o:gfxdata="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"/>
+              <v:shape w14:anchorId="6EDC5E9F" id="AutoShape 65" o:spid="_x0000_s1026" type="#_x0000_t32" style="position:absolute;margin-left:215.4pt;margin-top:319.2pt;width:11.05pt;height:65.4pt;flip:x y;z-index:251712512;visibility:visible;mso-wrap-style:square;mso-width-percent:0;mso-height-percent:0;mso-wrap-distance-left:9pt;mso-wrap-distance-top:0;mso-wrap-distance-right:9pt;mso-wrap-distance-bottom:0;mso-position-horizontal:absolute;mso-position-horizontal-relative:text;mso-position-vertical:absolute;mso-position-vertical-relative:text;mso-width-percent:0;mso-height-percent:0;mso-width-relative:page;mso-height-relative:page" o:gfxdata="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"/>
             </w:pict>
           </mc:Fallback>
         </mc:AlternateContent>
@@ -1035,7 +961,7 @@
         <mc:AlternateContent>
           <mc:Choice Requires="wps">
             <w:drawing>
-              <wp:anchor distT="0" distB="0" distL="114300" distR="114300" simplePos="0" relativeHeight="252057600" behindDoc="0" locked="0" layoutInCell="1" allowOverlap="1" wp14:anchorId="238728D4" wp14:editId="510DED53">
+              <wp:anchor distT="0" distB="0" distL="114300" distR="114300" simplePos="0" relativeHeight="251711488" behindDoc="0" locked="0" layoutInCell="1" allowOverlap="1" wp14:anchorId="238728D4" wp14:editId="510DED53">
                 <wp:simplePos x="0" y="0"/>
                 <wp:positionH relativeFrom="column">
                   <wp:posOffset>1104900</wp:posOffset>
@@ -1096,7 +1022,7 @@
           </mc:Choice>
           <mc:Fallback>
             <w:pict>
-              <v:shape w14:anchorId="3B4B23F3" id="AutoShape 64" o:spid="_x0000_s1026" type="#_x0000_t32" style="position:absolute;margin-left:87pt;margin-top:385.2pt;width:17.4pt;height:36.35pt;flip:x;z-index:252057600;visibility:visible;mso-wrap-style:square;mso-width-percent:0;mso-height-percent:0;mso-wrap-distance-left:9pt;mso-wrap-distance-top:0;mso-wrap-distance-right:9pt;mso-wrap-distance-bottom:0;mso-position-horizontal:absolute;mso-position-horizontal-relative:text;mso-position-vertical:absolute;mso-position-vertical-relative:text;mso-width-percent:0;mso-height-percent:0;mso-width-relative:page;mso-height-relative:page" o:gfxdata="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"/>
+              <v:shape w14:anchorId="67554529" id="AutoShape 64" o:spid="_x0000_s1026" type="#_x0000_t32" style="position:absolute;margin-left:87pt;margin-top:385.2pt;width:17.4pt;height:36.35pt;flip:x;z-index:251711488;visibility:visible;mso-wrap-style:square;mso-width-percent:0;mso-height-percent:0;mso-wrap-distance-left:9pt;mso-wrap-distance-top:0;mso-wrap-distance-right:9pt;mso-wrap-distance-bottom:0;mso-position-horizontal:absolute;mso-position-horizontal-relative:text;mso-position-vertical:absolute;mso-position-vertical-relative:text;mso-width-percent:0;mso-height-percent:0;mso-width-relative:page;mso-height-relative:page" o:gfxdata="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"/>
             </w:pict>
           </mc:Fallback>
         </mc:AlternateContent>
@@ -1109,7 +1035,7 @@
         <mc:AlternateContent>
           <mc:Choice Requires="wps">
             <w:drawing>
-              <wp:anchor distT="0" distB="0" distL="114300" distR="114300" simplePos="0" relativeHeight="252039168" behindDoc="0" locked="0" layoutInCell="1" allowOverlap="1" wp14:anchorId="21CA63D9" wp14:editId="2D79B1DC">
+              <wp:anchor distT="0" distB="0" distL="114300" distR="114300" simplePos="0" relativeHeight="251710464" behindDoc="0" locked="0" layoutInCell="1" allowOverlap="1" wp14:anchorId="21CA63D9" wp14:editId="2D79B1DC">
                 <wp:simplePos x="0" y="0"/>
                 <wp:positionH relativeFrom="column">
                   <wp:posOffset>3878580</wp:posOffset>
@@ -1170,7 +1096,7 @@
           </mc:Choice>
           <mc:Fallback>
             <w:pict>
-              <v:shape w14:anchorId="76FF8C0D" id="AutoShape 63" o:spid="_x0000_s1026" type="#_x0000_t32" style="position:absolute;margin-left:305.4pt;margin-top:316.8pt;width:10.2pt;height:61.2pt;flip:y;z-index:252039168;visibility:visible;mso-wrap-style:square;mso-width-percent:0;mso-height-percent:0;mso-wrap-distance-left:9pt;mso-wrap-distance-top:0;mso-wrap-distance-right:9pt;mso-wrap-distance-bottom:0;mso-position-horizontal:absolute;mso-position-horizontal-relative:text;mso-position-vertical:absolute;mso-position-vertical-relative:text;mso-width-percent:0;mso-height-percent:0;mso-width-relative:page;mso-height-relative:page" o:gfxdata="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"/>
+              <v:shape w14:anchorId="57710E9B" id="AutoShape 63" o:spid="_x0000_s1026" type="#_x0000_t32" style="position:absolute;margin-left:305.4pt;margin-top:316.8pt;width:10.2pt;height:61.2pt;flip:y;z-index:251710464;visibility:visible;mso-wrap-style:square;mso-width-percent:0;mso-height-percent:0;mso-wrap-distance-left:9pt;mso-wrap-distance-top:0;mso-wrap-distance-right:9pt;mso-wrap-distance-bottom:0;mso-position-horizontal:absolute;mso-position-horizontal-relative:text;mso-position-vertical:absolute;mso-position-vertical-relative:text;mso-width-percent:0;mso-height-percent:0;mso-width-relative:page;mso-height-relative:page" o:gfxdata="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"/>
             </w:pict>
           </mc:Fallback>
         </mc:AlternateContent>
@@ -1183,7 +1109,7 @@
         <mc:AlternateContent>
           <mc:Choice Requires="wps">
             <w:drawing>
-              <wp:anchor distT="0" distB="0" distL="114300" distR="114300" simplePos="0" relativeHeight="252020736" behindDoc="0" locked="0" layoutInCell="1" allowOverlap="1" wp14:anchorId="35106B7F" wp14:editId="2432736A">
+              <wp:anchor distT="0" distB="0" distL="114300" distR="114300" simplePos="0" relativeHeight="251709440" behindDoc="0" locked="0" layoutInCell="1" allowOverlap="1" wp14:anchorId="35106B7F" wp14:editId="2432736A">
                 <wp:simplePos x="0" y="0"/>
                 <wp:positionH relativeFrom="column">
                   <wp:posOffset>5783580</wp:posOffset>
@@ -1244,7 +1170,7 @@
           </mc:Choice>
           <mc:Fallback>
             <w:pict>
-              <v:shape w14:anchorId="72ED6AE6" id="AutoShape 62" o:spid="_x0000_s1026" type="#_x0000_t32" style="position:absolute;margin-left:455.4pt;margin-top:376.8pt;width:18pt;height:33pt;z-index:252020736;visibility:visible;mso-wrap-style:square;mso-width-percent:0;mso-height-percent:0;mso-wrap-distance-left:9pt;mso-wrap-distance-top:0;mso-wrap-distance-right:9pt;mso-wrap-distance-bottom:0;mso-position-horizontal:absolute;mso-position-horizontal-relative:text;mso-position-vertical:absolute;mso-position-vertical-relative:text;mso-width-percent:0;mso-height-percent:0;mso-width-relative:page;mso-height-relative:page" o:gfxdata="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"/>
+              <v:shape w14:anchorId="252F123B" id="AutoShape 62" o:spid="_x0000_s1026" type="#_x0000_t32" style="position:absolute;margin-left:455.4pt;margin-top:376.8pt;width:18pt;height:33pt;z-index:251709440;visibility:visible;mso-wrap-style:square;mso-width-percent:0;mso-height-percent:0;mso-wrap-distance-left:9pt;mso-wrap-distance-top:0;mso-wrap-distance-right:9pt;mso-wrap-distance-bottom:0;mso-position-horizontal:absolute;mso-position-horizontal-relative:text;mso-position-vertical:absolute;mso-position-vertical-relative:text;mso-width-percent:0;mso-height-percent:0;mso-width-relative:page;mso-height-relative:page" o:gfxdata="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"/>
             </w:pict>
           </mc:Fallback>
         </mc:AlternateContent>
@@ -1257,7 +1183,7 @@
         <mc:AlternateContent>
           <mc:Choice Requires="wps">
             <w:drawing>
-              <wp:anchor distT="0" distB="0" distL="114300" distR="114300" simplePos="0" relativeHeight="252002304" behindDoc="0" locked="0" layoutInCell="1" allowOverlap="1" wp14:anchorId="03C9820D" wp14:editId="3B67708B">
+              <wp:anchor distT="0" distB="0" distL="114300" distR="114300" simplePos="0" relativeHeight="251708416" behindDoc="0" locked="0" layoutInCell="1" allowOverlap="1" wp14:anchorId="03C9820D" wp14:editId="3B67708B">
                 <wp:simplePos x="0" y="0"/>
                 <wp:positionH relativeFrom="column">
                   <wp:posOffset>4175760</wp:posOffset>
@@ -1318,7 +1244,7 @@
           </mc:Choice>
           <mc:Fallback>
             <w:pict>
-              <v:shape w14:anchorId="31D5367F" id="AutoShape 61" o:spid="_x0000_s1026" type="#_x0000_t32" style="position:absolute;margin-left:328.8pt;margin-top:319.2pt;width:58.8pt;height:22.2pt;flip:x y;z-index:252002304;visibility:visible;mso-wrap-style:square;mso-width-percent:0;mso-height-percent:0;mso-wrap-distance-left:9pt;mso-wrap-distance-top:0;mso-wrap-distance-right:9pt;mso-wrap-distance-bottom:0;mso-position-horizontal:absolute;mso-position-horizontal-relative:text;mso-position-vertical:absolute;mso-position-vertical-relative:text;mso-width-percent:0;mso-height-percent:0;mso-width-relative:page;mso-height-relative:page" o:gfxdata="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"/>
+              <v:shape w14:anchorId="63B32087" id="AutoShape 61" o:spid="_x0000_s1026" type="#_x0000_t32" style="position:absolute;margin-left:328.8pt;margin-top:319.2pt;width:58.8pt;height:22.2pt;flip:x y;z-index:251708416;visibility:visible;mso-wrap-style:square;mso-width-percent:0;mso-height-percent:0;mso-wrap-distance-left:9pt;mso-wrap-distance-top:0;mso-wrap-distance-right:9pt;mso-wrap-distance-bottom:0;mso-position-horizontal:absolute;mso-position-horizontal-relative:text;mso-position-vertical:absolute;mso-position-vertical-relative:text;mso-width-percent:0;mso-height-percent:0;mso-width-relative:page;mso-height-relative:page" o:gfxdata="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"/>
             </w:pict>
           </mc:Fallback>
         </mc:AlternateContent>
@@ -1331,7 +1257,7 @@
         <mc:AlternateContent>
           <mc:Choice Requires="wps">
             <w:drawing>
-              <wp:anchor distT="0" distB="0" distL="114300" distR="114300" simplePos="0" relativeHeight="251983872" behindDoc="0" locked="0" layoutInCell="1" allowOverlap="1" wp14:anchorId="0873595A" wp14:editId="400CBB83">
+              <wp:anchor distT="0" distB="0" distL="114300" distR="114300" simplePos="0" relativeHeight="251707392" behindDoc="0" locked="0" layoutInCell="1" allowOverlap="1" wp14:anchorId="0873595A" wp14:editId="400CBB83">
                 <wp:simplePos x="0" y="0"/>
                 <wp:positionH relativeFrom="column">
                   <wp:posOffset>4175760</wp:posOffset>
@@ -1392,7 +1318,7 @@
           </mc:Choice>
           <mc:Fallback>
             <w:pict>
-              <v:shape w14:anchorId="6D8886DE" id="AutoShape 60" o:spid="_x0000_s1026" type="#_x0000_t32" style="position:absolute;margin-left:328.8pt;margin-top:278.4pt;width:54.6pt;height:7.2pt;flip:x;z-index:251983872;visibility:visible;mso-wrap-style:square;mso-width-percent:0;mso-height-percent:0;mso-wrap-distance-left:9pt;mso-wrap-distance-top:0;mso-wrap-distance-right:9pt;mso-wrap-distance-bottom:0;mso-position-horizontal:absolute;mso-position-horizontal-relative:text;mso-position-vertical:absolute;mso-position-vertical-relative:text;mso-width-percent:0;mso-height-percent:0;mso-width-relative:page;mso-height-relative:page" o:gfxdata="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"/>
+              <v:shape w14:anchorId="71DFD273" id="AutoShape 60" o:spid="_x0000_s1026" type="#_x0000_t32" style="position:absolute;margin-left:328.8pt;margin-top:278.4pt;width:54.6pt;height:7.2pt;flip:x;z-index:251707392;visibility:visible;mso-wrap-style:square;mso-width-percent:0;mso-height-percent:0;mso-wrap-distance-left:9pt;mso-wrap-distance-top:0;mso-wrap-distance-right:9pt;mso-wrap-distance-bottom:0;mso-position-horizontal:absolute;mso-position-horizontal-relative:text;mso-position-vertical:absolute;mso-position-vertical-relative:text;mso-width-percent:0;mso-height-percent:0;mso-width-relative:page;mso-height-relative:page" o:gfxdata="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"/>
             </w:pict>
           </mc:Fallback>
         </mc:AlternateContent>
@@ -1405,7 +1331,7 @@
         <mc:AlternateContent>
           <mc:Choice Requires="wps">
             <w:drawing>
-              <wp:anchor distT="0" distB="0" distL="114300" distR="114300" simplePos="0" relativeHeight="251965440" behindDoc="0" locked="0" layoutInCell="1" allowOverlap="1" wp14:anchorId="432EFED3" wp14:editId="7D9E6711">
+              <wp:anchor distT="0" distB="0" distL="114300" distR="114300" simplePos="0" relativeHeight="251706368" behindDoc="0" locked="0" layoutInCell="1" allowOverlap="1" wp14:anchorId="432EFED3" wp14:editId="7D9E6711">
                 <wp:simplePos x="0" y="0"/>
                 <wp:positionH relativeFrom="column">
                   <wp:posOffset>3329940</wp:posOffset>
@@ -1466,7 +1392,7 @@
           </mc:Choice>
           <mc:Fallback>
             <w:pict>
-              <v:shape w14:anchorId="7B56B061" id="AutoShape 59" o:spid="_x0000_s1026" type="#_x0000_t32" style="position:absolute;margin-left:262.2pt;margin-top:316.8pt;width:1.2pt;height:37.2pt;flip:x y;z-index:251965440;visibility:visible;mso-wrap-style:square;mso-width-percent:0;mso-height-percent:0;mso-wrap-distance-left:9pt;mso-wrap-distance-top:0;mso-wrap-distance-right:9pt;mso-wrap-distance-bottom:0;mso-position-horizontal:absolute;mso-position-horizontal-relative:text;mso-position-vertical:absolute;mso-position-vertical-relative:text;mso-width-percent:0;mso-height-percent:0;mso-width-relative:page;mso-height-relative:page" o:gfxdata="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"/>
+              <v:shape w14:anchorId="79B8EFD8" id="AutoShape 59" o:spid="_x0000_s1026" type="#_x0000_t32" style="position:absolute;margin-left:262.2pt;margin-top:316.8pt;width:1.2pt;height:37.2pt;flip:x y;z-index:251706368;visibility:visible;mso-wrap-style:square;mso-width-percent:0;mso-height-percent:0;mso-wrap-distance-left:9pt;mso-wrap-distance-top:0;mso-wrap-distance-right:9pt;mso-wrap-distance-bottom:0;mso-position-horizontal:absolute;mso-position-horizontal-relative:text;mso-position-vertical:absolute;mso-position-vertical-relative:text;mso-width-percent:0;mso-height-percent:0;mso-width-relative:page;mso-height-relative:page" o:gfxdata="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"/>
             </w:pict>
           </mc:Fallback>
         </mc:AlternateContent>
@@ -1479,7 +1405,7 @@
         <mc:AlternateContent>
           <mc:Choice Requires="wps">
             <w:drawing>
-              <wp:anchor distT="0" distB="0" distL="114300" distR="114300" simplePos="0" relativeHeight="251947008" behindDoc="0" locked="0" layoutInCell="1" allowOverlap="1" wp14:anchorId="253C0330" wp14:editId="664F468E">
+              <wp:anchor distT="0" distB="0" distL="114300" distR="114300" simplePos="0" relativeHeight="251705344" behindDoc="0" locked="0" layoutInCell="1" allowOverlap="1" wp14:anchorId="253C0330" wp14:editId="664F468E">
                 <wp:simplePos x="0" y="0"/>
                 <wp:positionH relativeFrom="column">
                   <wp:posOffset>2087880</wp:posOffset>
@@ -1540,7 +1466,7 @@
           </mc:Choice>
           <mc:Fallback>
             <w:pict>
-              <v:shape w14:anchorId="025BCC88" id="AutoShape 58" o:spid="_x0000_s1026" type="#_x0000_t32" style="position:absolute;margin-left:164.4pt;margin-top:318pt;width:42.6pt;height:13.8pt;flip:y;z-index:251947008;visibility:visible;mso-wrap-style:square;mso-width-percent:0;mso-height-percent:0;mso-wrap-distance-left:9pt;mso-wrap-distance-top:0;mso-wrap-distance-right:9pt;mso-wrap-distance-bottom:0;mso-position-horizontal:absolute;mso-position-horizontal-relative:text;mso-position-vertical:absolute;mso-position-vertical-relative:text;mso-width-percent:0;mso-height-percent:0;mso-width-relative:page;mso-height-relative:page" o:gfxdata="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"/>
+              <v:shape w14:anchorId="5EA2CC8D" id="AutoShape 58" o:spid="_x0000_s1026" type="#_x0000_t32" style="position:absolute;margin-left:164.4pt;margin-top:318pt;width:42.6pt;height:13.8pt;flip:y;z-index:251705344;visibility:visible;mso-wrap-style:square;mso-width-percent:0;mso-height-percent:0;mso-wrap-distance-left:9pt;mso-wrap-distance-top:0;mso-wrap-distance-right:9pt;mso-wrap-distance-bottom:0;mso-position-horizontal:absolute;mso-position-horizontal-relative:text;mso-position-vertical:absolute;mso-position-vertical-relative:text;mso-width-percent:0;mso-height-percent:0;mso-width-relative:page;mso-height-relative:page" o:gfxdata="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"/>
             </w:pict>
           </mc:Fallback>
         </mc:AlternateContent>
@@ -1553,7 +1479,7 @@
         <mc:AlternateContent>
           <mc:Choice Requires="wps">
             <w:drawing>
-              <wp:anchor distT="0" distB="0" distL="114300" distR="114300" simplePos="0" relativeHeight="251928576" behindDoc="0" locked="0" layoutInCell="1" allowOverlap="1" wp14:anchorId="2A122F5E" wp14:editId="505A38A4">
+              <wp:anchor distT="0" distB="0" distL="114300" distR="114300" simplePos="0" relativeHeight="251704320" behindDoc="0" locked="0" layoutInCell="1" allowOverlap="1" wp14:anchorId="2A122F5E" wp14:editId="505A38A4">
                 <wp:simplePos x="0" y="0"/>
                 <wp:positionH relativeFrom="column">
                   <wp:posOffset>2080260</wp:posOffset>
@@ -1614,7 +1540,7 @@
           </mc:Choice>
           <mc:Fallback>
             <w:pict>
-              <v:shape w14:anchorId="4BB2AF7E" id="AutoShape 57" o:spid="_x0000_s1026" type="#_x0000_t32" style="position:absolute;margin-left:163.8pt;margin-top:274.8pt;width:42pt;height:16.2pt;z-index:251928576;visibility:visible;mso-wrap-style:square;mso-width-percent:0;mso-height-percent:0;mso-wrap-distance-left:9pt;mso-wrap-distance-top:0;mso-wrap-distance-right:9pt;mso-wrap-distance-bottom:0;mso-position-horizontal:absolute;mso-position-horizontal-relative:text;mso-position-vertical:absolute;mso-position-vertical-relative:text;mso-width-percent:0;mso-height-percent:0;mso-width-relative:page;mso-height-relative:page" o:gfxdata="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"/>
+              <v:shape w14:anchorId="2C10A0FB" id="AutoShape 57" o:spid="_x0000_s1026" type="#_x0000_t32" style="position:absolute;margin-left:163.8pt;margin-top:274.8pt;width:42pt;height:16.2pt;z-index:251704320;visibility:visible;mso-wrap-style:square;mso-width-percent:0;mso-height-percent:0;mso-wrap-distance-left:9pt;mso-wrap-distance-top:0;mso-wrap-distance-right:9pt;mso-wrap-distance-bottom:0;mso-position-horizontal:absolute;mso-position-horizontal-relative:text;mso-position-vertical:absolute;mso-position-vertical-relative:text;mso-width-percent:0;mso-height-percent:0;mso-width-relative:page;mso-height-relative:page" o:gfxdata="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"/>
             </w:pict>
           </mc:Fallback>
         </mc:AlternateContent>
@@ -1627,7 +1553,7 @@
         <mc:AlternateContent>
           <mc:Choice Requires="wps">
             <w:drawing>
-              <wp:anchor distT="0" distB="0" distL="114300" distR="114300" simplePos="0" relativeHeight="251910144" behindDoc="0" locked="0" layoutInCell="1" allowOverlap="1" wp14:anchorId="477E7D6D" wp14:editId="4EA6CF9F">
+              <wp:anchor distT="0" distB="0" distL="114300" distR="114300" simplePos="0" relativeHeight="251703296" behindDoc="0" locked="0" layoutInCell="1" allowOverlap="1" wp14:anchorId="477E7D6D" wp14:editId="4EA6CF9F">
                 <wp:simplePos x="0" y="0"/>
                 <wp:positionH relativeFrom="column">
                   <wp:posOffset>3589020</wp:posOffset>
@@ -1688,7 +1614,7 @@
           </mc:Choice>
           <mc:Fallback>
             <w:pict>
-              <v:shape w14:anchorId="3FD0BFF9" id="AutoShape 56" o:spid="_x0000_s1026" type="#_x0000_t32" style="position:absolute;margin-left:282.6pt;margin-top:239.4pt;width:6pt;height:43.8pt;z-index:251910144;visibility:visible;mso-wrap-style:square;mso-width-percent:0;mso-height-percent:0;mso-wrap-distance-left:9pt;mso-wrap-distance-top:0;mso-wrap-distance-right:9pt;mso-wrap-distance-bottom:0;mso-position-horizontal:absolute;mso-position-horizontal-relative:text;mso-position-vertical:absolute;mso-position-vertical-relative:text;mso-width-percent:0;mso-height-percent:0;mso-width-relative:page;mso-height-relative:page" o:gfxdata="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"/>
+              <v:shape w14:anchorId="78FD368E" id="AutoShape 56" o:spid="_x0000_s1026" type="#_x0000_t32" style="position:absolute;margin-left:282.6pt;margin-top:239.4pt;width:6pt;height:43.8pt;z-index:251703296;visibility:visible;mso-wrap-style:square;mso-width-percent:0;mso-height-percent:0;mso-wrap-distance-left:9pt;mso-wrap-distance-top:0;mso-wrap-distance-right:9pt;mso-wrap-distance-bottom:0;mso-position-horizontal:absolute;mso-position-horizontal-relative:text;mso-position-vertical:absolute;mso-position-vertical-relative:text;mso-width-percent:0;mso-height-percent:0;mso-width-relative:page;mso-height-relative:page" o:gfxdata="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"/>
             </w:pict>
           </mc:Fallback>
         </mc:AlternateContent>
@@ -1701,7 +1627,7 @@
         <mc:AlternateContent>
           <mc:Choice Requires="wps">
             <w:drawing>
-              <wp:anchor distT="0" distB="0" distL="114300" distR="114300" simplePos="0" relativeHeight="251889664" behindDoc="0" locked="0" layoutInCell="1" allowOverlap="1" wp14:anchorId="6EEEE6FE" wp14:editId="1E69B8E6">
+              <wp:anchor distT="0" distB="0" distL="114300" distR="114300" simplePos="0" relativeHeight="251701248" behindDoc="0" locked="0" layoutInCell="1" allowOverlap="1" wp14:anchorId="6EEEE6FE" wp14:editId="1E69B8E6">
                 <wp:simplePos x="0" y="0"/>
                 <wp:positionH relativeFrom="column">
                   <wp:posOffset>5364480</wp:posOffset>
@@ -1762,7 +1688,7 @@
           </mc:Choice>
           <mc:Fallback>
             <w:pict>
-              <v:shape w14:anchorId="5E3EC977" id="AutoShape 54" o:spid="_x0000_s1026" type="#_x0000_t32" style="position:absolute;margin-left:422.4pt;margin-top:182.15pt;width:4.2pt;height:20.05pt;flip:y;z-index:251889664;visibility:visible;mso-wrap-style:square;mso-width-percent:0;mso-height-percent:0;mso-wrap-distance-left:9pt;mso-wrap-distance-top:0;mso-wrap-distance-right:9pt;mso-wrap-distance-bottom:0;mso-position-horizontal:absolute;mso-position-horizontal-relative:text;mso-position-vertical:absolute;mso-position-vertical-relative:text;mso-width-percent:0;mso-height-percent:0;mso-width-relative:page;mso-height-relative:page" o:gfxdata="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"/>
+              <v:shape w14:anchorId="7F8A709E" id="AutoShape 54" o:spid="_x0000_s1026" type="#_x0000_t32" style="position:absolute;margin-left:422.4pt;margin-top:182.15pt;width:4.2pt;height:20.05pt;flip:y;z-index:251701248;visibility:visible;mso-wrap-style:square;mso-width-percent:0;mso-height-percent:0;mso-wrap-distance-left:9pt;mso-wrap-distance-top:0;mso-wrap-distance-right:9pt;mso-wrap-distance-bottom:0;mso-position-horizontal:absolute;mso-position-horizontal-relative:text;mso-position-vertical:absolute;mso-position-vertical-relative:text;mso-width-percent:0;mso-height-percent:0;mso-width-relative:page;mso-height-relative:page" o:gfxdata="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"/>
             </w:pict>
           </mc:Fallback>
         </mc:AlternateContent>
@@ -1775,7 +1701,7 @@
         <mc:AlternateContent>
           <mc:Choice Requires="wps">
             <w:drawing>
-              <wp:anchor distT="0" distB="0" distL="114300" distR="114300" simplePos="0" relativeHeight="251871232" behindDoc="0" locked="0" layoutInCell="1" allowOverlap="1" wp14:anchorId="260D97C6" wp14:editId="4655195B">
+              <wp:anchor distT="0" distB="0" distL="114300" distR="114300" simplePos="0" relativeHeight="251700224" behindDoc="0" locked="0" layoutInCell="1" allowOverlap="1" wp14:anchorId="260D97C6" wp14:editId="4655195B">
                 <wp:simplePos x="0" y="0"/>
                 <wp:positionH relativeFrom="column">
                   <wp:posOffset>2537460</wp:posOffset>
@@ -1836,7 +1762,7 @@
           </mc:Choice>
           <mc:Fallback>
             <w:pict>
-              <v:shape w14:anchorId="5ACDFA32" id="AutoShape 53" o:spid="_x0000_s1026" type="#_x0000_t32" style="position:absolute;margin-left:199.8pt;margin-top:217.2pt;width:9pt;height:68.4pt;z-index:251871232;visibility:visible;mso-wrap-style:square;mso-width-percent:0;mso-height-percent:0;mso-wrap-distance-left:9pt;mso-wrap-distance-top:0;mso-wrap-distance-right:9pt;mso-wrap-distance-bottom:0;mso-position-horizontal:absolute;mso-position-horizontal-relative:text;mso-position-vertical:absolute;mso-position-vertical-relative:text;mso-width-percent:0;mso-height-percent:0;mso-width-relative:page;mso-height-relative:page" o:gfxdata="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"/>
+              <v:shape w14:anchorId="4E412130" id="AutoShape 53" o:spid="_x0000_s1026" type="#_x0000_t32" style="position:absolute;margin-left:199.8pt;margin-top:217.2pt;width:9pt;height:68.4pt;z-index:251700224;visibility:visible;mso-wrap-style:square;mso-width-percent:0;mso-height-percent:0;mso-wrap-distance-left:9pt;mso-wrap-distance-top:0;mso-wrap-distance-right:9pt;mso-wrap-distance-bottom:0;mso-position-horizontal:absolute;mso-position-horizontal-relative:text;mso-position-vertical:absolute;mso-position-vertical-relative:text;mso-width-percent:0;mso-height-percent:0;mso-width-relative:page;mso-height-relative:page" o:gfxdata="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"/>
             </w:pict>
           </mc:Fallback>
         </mc:AlternateContent>
@@ -1849,7 +1775,7 @@
         <mc:AlternateContent>
           <mc:Choice Requires="wps">
             <w:drawing>
-              <wp:anchor distT="0" distB="0" distL="114300" distR="114300" simplePos="0" relativeHeight="251820032" behindDoc="0" locked="0" layoutInCell="1" allowOverlap="1" wp14:anchorId="12533647" wp14:editId="410ACFBD">
+              <wp:anchor distT="0" distB="0" distL="114300" distR="114300" simplePos="0" relativeHeight="251698176" behindDoc="0" locked="0" layoutInCell="1" allowOverlap="1" wp14:anchorId="12533647" wp14:editId="410ACFBD">
                 <wp:simplePos x="0" y="0"/>
                 <wp:positionH relativeFrom="column">
                   <wp:posOffset>4686300</wp:posOffset>
@@ -1910,7 +1836,7 @@
           </mc:Choice>
           <mc:Fallback>
             <w:pict>
-              <v:shape w14:anchorId="008BA1B1" id="AutoShape 51" o:spid="_x0000_s1026" type="#_x0000_t32" style="position:absolute;margin-left:369pt;margin-top:78pt;width:40.8pt;height:72.95pt;z-index:251820032;visibility:visible;mso-wrap-style:square;mso-width-percent:0;mso-height-percent:0;mso-wrap-distance-left:9pt;mso-wrap-distance-top:0;mso-wrap-distance-right:9pt;mso-wrap-distance-bottom:0;mso-position-horizontal:absolute;mso-position-horizontal-relative:text;mso-position-vertical:absolute;mso-position-vertical-relative:text;mso-width-percent:0;mso-height-percent:0;mso-width-relative:page;mso-height-relative:page" o:gfxdata="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"/>
+              <v:shape w14:anchorId="5C207B5E" id="AutoShape 51" o:spid="_x0000_s1026" type="#_x0000_t32" style="position:absolute;margin-left:369pt;margin-top:78pt;width:40.8pt;height:72.95pt;z-index:251698176;visibility:visible;mso-wrap-style:square;mso-width-percent:0;mso-height-percent:0;mso-wrap-distance-left:9pt;mso-wrap-distance-top:0;mso-wrap-distance-right:9pt;mso-wrap-distance-bottom:0;mso-position-horizontal:absolute;mso-position-horizontal-relative:text;mso-position-vertical:absolute;mso-position-vertical-relative:text;mso-width-percent:0;mso-height-percent:0;mso-width-relative:page;mso-height-relative:page" o:gfxdata="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"/>
             </w:pict>
           </mc:Fallback>
         </mc:AlternateContent>
@@ -1923,7 +1849,7 @@
         <mc:AlternateContent>
           <mc:Choice Requires="wps">
             <w:drawing>
-              <wp:anchor distT="0" distB="0" distL="114300" distR="114300" simplePos="0" relativeHeight="251799552" behindDoc="0" locked="0" layoutInCell="1" allowOverlap="1" wp14:anchorId="21BC8D6C" wp14:editId="0C4DE2D6">
+              <wp:anchor distT="0" distB="0" distL="114300" distR="114300" simplePos="0" relativeHeight="251697152" behindDoc="0" locked="0" layoutInCell="1" allowOverlap="1" wp14:anchorId="21BC8D6C" wp14:editId="0C4DE2D6">
                 <wp:simplePos x="0" y="0"/>
                 <wp:positionH relativeFrom="column">
                   <wp:posOffset>5417820</wp:posOffset>
@@ -1984,7 +1910,7 @@
           </mc:Choice>
           <mc:Fallback>
             <w:pict>
-              <v:shape w14:anchorId="64F0FE07" id="AutoShape 50" o:spid="_x0000_s1026" type="#_x0000_t32" style="position:absolute;margin-left:426.6pt;margin-top:107.4pt;width:8.4pt;height:42.6pt;z-index:251799552;visibility:visible;mso-wrap-style:square;mso-width-percent:0;mso-height-percent:0;mso-wrap-distance-left:9pt;mso-wrap-distance-top:0;mso-wrap-distance-right:9pt;mso-wrap-distance-bottom:0;mso-position-horizontal:absolute;mso-position-horizontal-relative:text;mso-position-vertical:absolute;mso-position-vertical-relative:text;mso-width-percent:0;mso-height-percent:0;mso-width-relative:page;mso-height-relative:page" o:gfxdata="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"/>
+              <v:shape w14:anchorId="44A254EE" id="AutoShape 50" o:spid="_x0000_s1026" type="#_x0000_t32" style="position:absolute;margin-left:426.6pt;margin-top:107.4pt;width:8.4pt;height:42.6pt;z-index:251697152;visibility:visible;mso-wrap-style:square;mso-width-percent:0;mso-height-percent:0;mso-wrap-distance-left:9pt;mso-wrap-distance-top:0;mso-wrap-distance-right:9pt;mso-wrap-distance-bottom:0;mso-position-horizontal:absolute;mso-position-horizontal-relative:text;mso-position-vertical:absolute;mso-position-vertical-relative:text;mso-width-percent:0;mso-height-percent:0;mso-width-relative:page;mso-height-relative:page" o:gfxdata="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"/>
             </w:pict>
           </mc:Fallback>
         </mc:AlternateContent>
@@ -1997,7 +1923,7 @@
         <mc:AlternateContent>
           <mc:Choice Requires="wps">
             <w:drawing>
-              <wp:anchor distT="0" distB="0" distL="114300" distR="114300" simplePos="0" relativeHeight="251779072" behindDoc="0" locked="0" layoutInCell="1" allowOverlap="1" wp14:anchorId="5F727780" wp14:editId="55978602">
+              <wp:anchor distT="0" distB="0" distL="114300" distR="114300" simplePos="0" relativeHeight="251695104" behindDoc="0" locked="0" layoutInCell="1" allowOverlap="1" wp14:anchorId="5F727780" wp14:editId="55978602">
                 <wp:simplePos x="0" y="0"/>
                 <wp:positionH relativeFrom="column">
                   <wp:posOffset>1219200</wp:posOffset>
@@ -2058,7 +1984,7 @@
           </mc:Choice>
           <mc:Fallback>
             <w:pict>
-              <v:shape w14:anchorId="4E9E5F34" id="AutoShape 48" o:spid="_x0000_s1026" type="#_x0000_t32" style="position:absolute;margin-left:96pt;margin-top:113.4pt;width:42.6pt;height:14.4pt;flip:x;z-index:251779072;visibility:visible;mso-wrap-style:square;mso-width-percent:0;mso-height-percent:0;mso-wrap-distance-left:9pt;mso-wrap-distance-top:0;mso-wrap-distance-right:9pt;mso-wrap-distance-bottom:0;mso-position-horizontal:absolute;mso-position-horizontal-relative:text;mso-position-vertical:absolute;mso-position-vertical-relative:text;mso-width-percent:0;mso-height-percent:0;mso-width-relative:page;mso-height-relative:page" o:gfxdata="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"/>
+              <v:shape w14:anchorId="2D9D3330" id="AutoShape 48" o:spid="_x0000_s1026" type="#_x0000_t32" style="position:absolute;margin-left:96pt;margin-top:113.4pt;width:42.6pt;height:14.4pt;flip:x;z-index:251695104;visibility:visible;mso-wrap-style:square;mso-width-percent:0;mso-height-percent:0;mso-wrap-distance-left:9pt;mso-wrap-distance-top:0;mso-wrap-distance-right:9pt;mso-wrap-distance-bottom:0;mso-position-horizontal:absolute;mso-position-horizontal-relative:text;mso-position-vertical:absolute;mso-position-vertical-relative:text;mso-width-percent:0;mso-height-percent:0;mso-width-relative:page;mso-height-relative:page" o:gfxdata="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"/>
             </w:pict>
           </mc:Fallback>
         </mc:AlternateContent>
@@ -2071,7 +1997,7 @@
         <mc:AlternateContent>
           <mc:Choice Requires="wps">
             <w:drawing>
-              <wp:anchor distT="0" distB="0" distL="114300" distR="114300" simplePos="0" relativeHeight="251758592" behindDoc="0" locked="0" layoutInCell="1" allowOverlap="1" wp14:anchorId="54AF3C19" wp14:editId="1AAC818C">
+              <wp:anchor distT="0" distB="0" distL="114300" distR="114300" simplePos="0" relativeHeight="251694080" behindDoc="0" locked="0" layoutInCell="1" allowOverlap="1" wp14:anchorId="54AF3C19" wp14:editId="1AAC818C">
                 <wp:simplePos x="0" y="0"/>
                 <wp:positionH relativeFrom="column">
                   <wp:posOffset>830580</wp:posOffset>
@@ -2132,7 +2058,7 @@
           </mc:Choice>
           <mc:Fallback>
             <w:pict>
-              <v:shape w14:anchorId="6520FB1C" id="AutoShape 47" o:spid="_x0000_s1026" type="#_x0000_t32" style="position:absolute;margin-left:65.4pt;margin-top:58.2pt;width:47.4pt;height:59.4pt;flip:x;z-index:251758592;visibility:visible;mso-wrap-style:square;mso-width-percent:0;mso-height-percent:0;mso-wrap-distance-left:9pt;mso-wrap-distance-top:0;mso-wrap-distance-right:9pt;mso-wrap-distance-bottom:0;mso-position-horizontal:absolute;mso-position-horizontal-relative:text;mso-position-vertical:absolute;mso-position-vertical-relative:text;mso-width-percent:0;mso-height-percent:0;mso-width-relative:page;mso-height-relative:page" o:gfxdata="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"/>
+              <v:shape w14:anchorId="398D4892" id="AutoShape 47" o:spid="_x0000_s1026" type="#_x0000_t32" style="position:absolute;margin-left:65.4pt;margin-top:58.2pt;width:47.4pt;height:59.4pt;flip:x;z-index:251694080;visibility:visible;mso-wrap-style:square;mso-width-percent:0;mso-height-percent:0;mso-wrap-distance-left:9pt;mso-wrap-distance-top:0;mso-wrap-distance-right:9pt;mso-wrap-distance-bottom:0;mso-position-horizontal:absolute;mso-position-horizontal-relative:text;mso-position-vertical:absolute;mso-position-vertical-relative:text;mso-width-percent:0;mso-height-percent:0;mso-width-relative:page;mso-height-relative:page" o:gfxdata="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"/>
             </w:pict>
           </mc:Fallback>
         </mc:AlternateContent>
@@ -2145,7 +2071,7 @@
         <mc:AlternateContent>
           <mc:Choice Requires="wps">
             <w:drawing>
-              <wp:anchor distT="0" distB="0" distL="114300" distR="114300" simplePos="0" relativeHeight="251738112" behindDoc="0" locked="0" layoutInCell="1" allowOverlap="1" wp14:anchorId="10C8D7B5" wp14:editId="6B2911F6">
+              <wp:anchor distT="0" distB="0" distL="114300" distR="114300" simplePos="0" relativeHeight="251693056" behindDoc="0" locked="0" layoutInCell="1" allowOverlap="1" wp14:anchorId="10C8D7B5" wp14:editId="6B2911F6">
                 <wp:simplePos x="0" y="0"/>
                 <wp:positionH relativeFrom="column">
                   <wp:posOffset>335280</wp:posOffset>
@@ -2206,7 +2132,7 @@
           </mc:Choice>
           <mc:Fallback>
             <w:pict>
-              <v:shape w14:anchorId="78261DA6" id="AutoShape 46" o:spid="_x0000_s1026" type="#_x0000_t32" style="position:absolute;margin-left:26.4pt;margin-top:64.8pt;width:19.8pt;height:52.8pt;z-index:251738112;visibility:visible;mso-wrap-style:square;mso-width-percent:0;mso-height-percent:0;mso-wrap-distance-left:9pt;mso-wrap-distance-top:0;mso-wrap-distance-right:9pt;mso-wrap-distance-bottom:0;mso-position-horizontal:absolute;mso-position-horizontal-relative:text;mso-position-vertical:absolute;mso-position-vertical-relative:text;mso-width-percent:0;mso-height-percent:0;mso-width-relative:page;mso-height-relative:page" o:gfxdata="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"/>
+              <v:shape w14:anchorId="081BCEAB" id="AutoShape 46" o:spid="_x0000_s1026" type="#_x0000_t32" style="position:absolute;margin-left:26.4pt;margin-top:64.8pt;width:19.8pt;height:52.8pt;z-index:251693056;visibility:visible;mso-wrap-style:square;mso-width-percent:0;mso-height-percent:0;mso-wrap-distance-left:9pt;mso-wrap-distance-top:0;mso-wrap-distance-right:9pt;mso-wrap-distance-bottom:0;mso-position-horizontal:absolute;mso-position-horizontal-relative:text;mso-position-vertical:absolute;mso-position-vertical-relative:text;mso-width-percent:0;mso-height-percent:0;mso-width-relative:page;mso-height-relative:page" o:gfxdata="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"/>
             </w:pict>
           </mc:Fallback>
         </mc:AlternateContent>
@@ -2219,7 +2145,7 @@
         <mc:AlternateContent>
           <mc:Choice Requires="wps">
             <w:drawing>
-              <wp:anchor distT="0" distB="0" distL="114300" distR="114300" simplePos="0" relativeHeight="251201536" behindDoc="0" locked="0" layoutInCell="1" allowOverlap="1" wp14:anchorId="2DAA374B" wp14:editId="4CD4ADAA">
+              <wp:anchor distT="0" distB="0" distL="114300" distR="114300" simplePos="0" relativeHeight="251659264" behindDoc="0" locked="0" layoutInCell="1" allowOverlap="1" wp14:anchorId="2DAA374B" wp14:editId="4CD4ADAA">
                 <wp:simplePos x="0" y="0"/>
                 <wp:positionH relativeFrom="column">
                   <wp:posOffset>152400</wp:posOffset>
@@ -2280,17 +2206,7 @@
                                 <w:sz w:val="36"/>
                                 <w:szCs w:val="36"/>
                               </w:rPr>
-                              <w:t>A</w:t>
-                            </w:r>
-                            <w:r>
-                              <w:rPr>
-                                <w:b/>
-                                <w:bCs/>
-                                <w:color w:val="000000" w:themeColor="text1"/>
-                                <w:sz w:val="36"/>
-                                <w:szCs w:val="36"/>
-                              </w:rPr>
-                              <w:t>thletes</w:t>
+                              <w:t>Athletes</w:t>
                             </w:r>
                           </w:p>
                         </w:txbxContent>
@@ -2312,7 +2228,7 @@
           </mc:Choice>
           <mc:Fallback>
             <w:pict>
-              <v:rect w14:anchorId="2DAA374B" id="Rectangle 4" o:spid="_x0000_s1029" style="position:absolute;margin-left:12pt;margin-top:117pt;width:84pt;height:31.2pt;z-index:251201536;visibility:visible;mso-wrap-style:square;mso-width-percent:0;mso-height-percent:0;mso-wrap-distance-left:9pt;mso-wrap-distance-top:0;mso-wrap-distance-right:9pt;mso-wrap-distance-bottom:0;mso-position-horizontal:absolute;mso-position-horizontal-relative:text;mso-position-vertical:absolute;mso-position-vertical-relative:text;mso-width-percent:0;mso-height-percent:0;mso-width-relative:page;mso-height-relative:page;v-text-anchor:top" o:gfxdata="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">
+              <v:rect w14:anchorId="2DAA374B" id="Rectangle 4" o:spid="_x0000_s1029" style="position:absolute;margin-left:12pt;margin-top:117pt;width:84pt;height:31.2pt;z-index:251659264;visibility:visible;mso-wrap-style:square;mso-width-percent:0;mso-height-percent:0;mso-wrap-distance-left:9pt;mso-wrap-distance-top:0;mso-wrap-distance-right:9pt;mso-wrap-distance-bottom:0;mso-position-horizontal:absolute;mso-position-horizontal-relative:text;mso-position-vertical:absolute;mso-position-vertical-relative:text;mso-width-percent:0;mso-height-percent:0;mso-width-relative:page;mso-height-relative:page;v-text-anchor:top" o:gfxdata="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">
                 <v:textbox>
                   <w:txbxContent>
                     <w:p>
@@ -2333,17 +2249,7 @@
                           <w:sz w:val="36"/>
                           <w:szCs w:val="36"/>
                         </w:rPr>
-                        <w:t>A</w:t>
-                      </w:r>
-                      <w:r>
-                        <w:rPr>
-                          <w:b/>
-                          <w:bCs/>
-                          <w:color w:val="000000" w:themeColor="text1"/>
-                          <w:sz w:val="36"/>
-                          <w:szCs w:val="36"/>
-                        </w:rPr>
-                        <w:t>thletes</w:t>
+                        <w:t>Athletes</w:t>
                       </w:r>
                     </w:p>
                   </w:txbxContent>
@@ -2361,7 +2267,7 @@
         <mc:AlternateContent>
           <mc:Choice Requires="wps">
             <w:drawing>
-              <wp:anchor distT="0" distB="0" distL="114300" distR="114300" simplePos="0" relativeHeight="251305984" behindDoc="0" locked="0" layoutInCell="1" allowOverlap="1" wp14:anchorId="2DAA374B" wp14:editId="6DC45317">
+              <wp:anchor distT="0" distB="0" distL="114300" distR="114300" simplePos="0" relativeHeight="251662336" behindDoc="0" locked="0" layoutInCell="1" allowOverlap="1" wp14:anchorId="2DAA374B" wp14:editId="6DC45317">
                 <wp:simplePos x="0" y="0"/>
                 <wp:positionH relativeFrom="column">
                   <wp:posOffset>4528820</wp:posOffset>
@@ -2425,18 +2331,7 @@
                                 <w:sz w:val="36"/>
                                 <w:szCs w:val="36"/>
                               </w:rPr>
-                              <w:t>O</w:t>
-                            </w:r>
-                            <w:r>
-                              <w:rPr>
-                                <w:rFonts w:ascii="Arial Black" w:hAnsi="Arial Black"/>
-                                <w:b/>
-                                <w:bCs/>
-                                <w:color w:val="000000" w:themeColor="text1"/>
-                                <w:sz w:val="36"/>
-                                <w:szCs w:val="36"/>
-                              </w:rPr>
-                              <w:t>lympicgames</w:t>
+                              <w:t>Olympicgames</w:t>
                             </w:r>
                             <w:proofErr w:type="spellEnd"/>
                           </w:p>
@@ -2459,7 +2354,7 @@
           </mc:Choice>
           <mc:Fallback>
             <w:pict>
-              <v:rect w14:anchorId="2DAA374B" id="Rectangle 7" o:spid="_x0000_s1030" style="position:absolute;margin-left:356.6pt;margin-top:410.75pt;width:166.2pt;height:31.2pt;z-index:251305984;visibility:visible;mso-wrap-style:square;mso-width-percent:0;mso-height-percent:0;mso-wrap-distance-left:9pt;mso-wrap-distance-top:0;mso-wrap-distance-right:9pt;mso-wrap-distance-bottom:0;mso-position-horizontal:absolute;mso-position-horizontal-relative:text;mso-position-vertical:absolute;mso-position-vertical-relative:text;mso-width-percent:0;mso-height-percent:0;mso-width-relative:page;mso-height-relative:page;v-text-anchor:top" o:gfxdata="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">
+              <v:rect w14:anchorId="2DAA374B" id="Rectangle 7" o:spid="_x0000_s1030" style="position:absolute;margin-left:356.6pt;margin-top:410.75pt;width:166.2pt;height:31.2pt;z-index:251662336;visibility:visible;mso-wrap-style:square;mso-width-percent:0;mso-height-percent:0;mso-wrap-distance-left:9pt;mso-wrap-distance-top:0;mso-wrap-distance-right:9pt;mso-wrap-distance-bottom:0;mso-position-horizontal:absolute;mso-position-horizontal-relative:text;mso-position-vertical:absolute;mso-position-vertical-relative:text;mso-width-percent:0;mso-height-percent:0;mso-width-relative:page;mso-height-relative:page;v-text-anchor:top" o:gfxdata="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">
                 <v:textbox>
                   <w:txbxContent>
                     <w:p>
@@ -2483,18 +2378,7 @@
                           <w:sz w:val="36"/>
                           <w:szCs w:val="36"/>
                         </w:rPr>
-                        <w:t>O</w:t>
-                      </w:r>
-                      <w:r>
-                        <w:rPr>
-                          <w:rFonts w:ascii="Arial Black" w:hAnsi="Arial Black"/>
-                          <w:b/>
-                          <w:bCs/>
-                          <w:color w:val="000000" w:themeColor="text1"/>
-                          <w:sz w:val="36"/>
-                          <w:szCs w:val="36"/>
-                        </w:rPr>
-                        <w:t>lympicgames</w:t>
+                        <w:t>Olympicgames</w:t>
                       </w:r>
                       <w:proofErr w:type="spellEnd"/>
                     </w:p>
@@ -2513,7 +2397,7 @@
         <mc:AlternateContent>
           <mc:Choice Requires="wps">
             <w:drawing>
-              <wp:anchor distT="0" distB="0" distL="114300" distR="114300" simplePos="0" relativeHeight="251269120" behindDoc="0" locked="0" layoutInCell="1" allowOverlap="1" wp14:anchorId="2DAA374B" wp14:editId="11618D42">
+              <wp:anchor distT="0" distB="0" distL="114300" distR="114300" simplePos="0" relativeHeight="251661312" behindDoc="0" locked="0" layoutInCell="1" allowOverlap="1" wp14:anchorId="2DAA374B" wp14:editId="11618D42">
                 <wp:simplePos x="0" y="0"/>
                 <wp:positionH relativeFrom="column">
                   <wp:posOffset>360680</wp:posOffset>
@@ -2572,16 +2456,7 @@
                                 <w:sz w:val="36"/>
                                 <w:szCs w:val="36"/>
                               </w:rPr>
-                              <w:t>C</w:t>
-                            </w:r>
-                            <w:r>
-                              <w:rPr>
-                                <w:rFonts w:ascii="Arial Black" w:hAnsi="Arial Black"/>
-                                <w:color w:val="000000" w:themeColor="text1"/>
-                                <w:sz w:val="36"/>
-                                <w:szCs w:val="36"/>
-                              </w:rPr>
-                              <w:t>ountries</w:t>
+                              <w:t>Countries</w:t>
                             </w:r>
                           </w:p>
                         </w:txbxContent>
@@ -2603,7 +2478,7 @@
           </mc:Choice>
           <mc:Fallback>
             <w:pict>
-              <v:rect w14:anchorId="2DAA374B" id="Rectangle 6" o:spid="_x0000_s1031" style="position:absolute;margin-left:28.4pt;margin-top:421.55pt;width:111.6pt;height:31.2pt;z-index:251269120;visibility:visible;mso-wrap-style:square;mso-width-percent:0;mso-height-percent:0;mso-wrap-distance-left:9pt;mso-wrap-distance-top:0;mso-wrap-distance-right:9pt;mso-wrap-distance-bottom:0;mso-position-horizontal:absolute;mso-position-horizontal-relative:text;mso-position-vertical:absolute;mso-position-vertical-relative:text;mso-width-percent:0;mso-height-percent:0;mso-width-relative:page;mso-height-relative:page;v-text-anchor:top" o:gfxdata="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">
+              <v:rect w14:anchorId="2DAA374B" id="Rectangle 6" o:spid="_x0000_s1031" style="position:absolute;margin-left:28.4pt;margin-top:421.55pt;width:111.6pt;height:31.2pt;z-index:251661312;visibility:visible;mso-wrap-style:square;mso-width-percent:0;mso-height-percent:0;mso-wrap-distance-left:9pt;mso-wrap-distance-top:0;mso-wrap-distance-right:9pt;mso-wrap-distance-bottom:0;mso-position-horizontal:absolute;mso-position-horizontal-relative:text;mso-position-vertical:absolute;mso-position-vertical-relative:text;mso-width-percent:0;mso-height-percent:0;mso-width-relative:page;mso-height-relative:page;v-text-anchor:top" o:gfxdata="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">
                 <v:textbox>
                   <w:txbxContent>
                     <w:p>
@@ -2622,16 +2497,7 @@
                           <w:sz w:val="36"/>
                           <w:szCs w:val="36"/>
                         </w:rPr>
-                        <w:t>C</w:t>
-                      </w:r>
-                      <w:r>
-                        <w:rPr>
-                          <w:rFonts w:ascii="Arial Black" w:hAnsi="Arial Black"/>
-                          <w:color w:val="000000" w:themeColor="text1"/>
-                          <w:sz w:val="36"/>
-                          <w:szCs w:val="36"/>
-                        </w:rPr>
-                        <w:t>ountries</w:t>
+                        <w:t>Countries</w:t>
                       </w:r>
                     </w:p>
                   </w:txbxContent>
@@ -2650,7 +2516,7 @@
         <mc:AlternateContent>
           <mc:Choice Requires="wps">
             <w:drawing>
-              <wp:anchor distT="0" distB="0" distL="114300" distR="114300" simplePos="0" relativeHeight="251164672" behindDoc="0" locked="0" layoutInCell="1" allowOverlap="1" wp14:anchorId="043E515F" wp14:editId="22FD4207">
+              <wp:anchor distT="0" distB="0" distL="114300" distR="114300" simplePos="0" relativeHeight="251658240" behindDoc="0" locked="0" layoutInCell="1" allowOverlap="1" wp14:anchorId="043E515F" wp14:editId="22FD4207">
                 <wp:simplePos x="0" y="0"/>
                 <wp:positionH relativeFrom="column">
                   <wp:posOffset>2613660</wp:posOffset>
@@ -2711,17 +2577,7 @@
                                 <w:sz w:val="36"/>
                                 <w:szCs w:val="36"/>
                               </w:rPr>
-                              <w:t>P</w:t>
-                            </w:r>
-                            <w:r>
-                              <w:rPr>
-                                <w:b/>
-                                <w:bCs/>
-                                <w:color w:val="000000" w:themeColor="text1"/>
-                                <w:sz w:val="36"/>
-                                <w:szCs w:val="36"/>
-                              </w:rPr>
-                              <w:t>articipations</w:t>
+                              <w:t>Participations</w:t>
                             </w:r>
                           </w:p>
                         </w:txbxContent>
@@ -2743,7 +2599,7 @@
           </mc:Choice>
           <mc:Fallback>
             <w:pict>
-              <v:rect w14:anchorId="043E515F" id="Rectangle 2" o:spid="_x0000_s1032" style="position:absolute;margin-left:205.8pt;margin-top:283.8pt;width:122.4pt;height:34.2pt;z-index:251164672;visibility:visible;mso-wrap-style:square;mso-width-percent:0;mso-height-percent:0;mso-wrap-distance-left:9pt;mso-wrap-distance-top:0;mso-wrap-distance-right:9pt;mso-wrap-distance-bottom:0;mso-position-horizontal:absolute;mso-position-horizontal-relative:text;mso-position-vertical:absolute;mso-position-vertical-relative:text;mso-width-percent:0;mso-height-percent:0;mso-width-relative:page;mso-height-relative:page;v-text-anchor:top" o:gfxdata="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">
+              <v:rect w14:anchorId="043E515F" id="Rectangle 2" o:spid="_x0000_s1032" style="position:absolute;margin-left:205.8pt;margin-top:283.8pt;width:122.4pt;height:34.2pt;z-index:251658240;visibility:visible;mso-wrap-style:square;mso-width-percent:0;mso-height-percent:0;mso-wrap-distance-left:9pt;mso-wrap-distance-top:0;mso-wrap-distance-right:9pt;mso-wrap-distance-bottom:0;mso-position-horizontal:absolute;mso-position-horizontal-relative:text;mso-position-vertical:absolute;mso-position-vertical-relative:text;mso-width-percent:0;mso-height-percent:0;mso-width-relative:page;mso-height-relative:page;v-text-anchor:top" o:gfxdata="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">
                 <v:textbox>
                   <w:txbxContent>
                     <w:p>
@@ -2764,17 +2620,7 @@
                           <w:sz w:val="36"/>
                           <w:szCs w:val="36"/>
                         </w:rPr>
-                        <w:t>P</w:t>
-                      </w:r>
-                      <w:r>
-                        <w:rPr>
-                          <w:b/>
-                          <w:bCs/>
-                          <w:color w:val="000000" w:themeColor="text1"/>
-                          <w:sz w:val="36"/>
-                          <w:szCs w:val="36"/>
-                        </w:rPr>
-                        <w:t>articipations</w:t>
+                        <w:t>Participations</w:t>
                       </w:r>
                     </w:p>
                   </w:txbxContent>
@@ -2794,7 +2640,7 @@
         <mc:AlternateContent>
           <mc:Choice Requires="wps">
             <w:drawing>
-              <wp:anchor distT="0" distB="0" distL="114300" distR="114300" simplePos="0" relativeHeight="251344896" behindDoc="0" locked="0" layoutInCell="1" allowOverlap="1" wp14:anchorId="1FA65CF9" wp14:editId="001E55CF">
+              <wp:anchor distT="0" distB="0" distL="114300" distR="114300" simplePos="0" relativeHeight="251672576" behindDoc="0" locked="0" layoutInCell="1" allowOverlap="1" wp14:anchorId="1FA65CF9" wp14:editId="001E55CF">
                 <wp:simplePos x="0" y="0"/>
                 <wp:positionH relativeFrom="column">
                   <wp:posOffset>1025525</wp:posOffset>
@@ -2869,7 +2715,7 @@
           </mc:Choice>
           <mc:Fallback>
             <w:pict>
-              <v:oval w14:anchorId="1FA65CF9" id="Oval 23" o:spid="_x0000_s1033" style="position:absolute;margin-left:80.75pt;margin-top:9.15pt;width:63.55pt;height:28.65pt;z-index:251344896;visibility:visible;mso-wrap-style:square;mso-width-percent:0;mso-height-percent:0;mso-wrap-distance-left:9pt;mso-wrap-distance-top:0;mso-wrap-distance-right:9pt;mso-wrap-distance-bottom:0;mso-position-horizontal:absolute;mso-position-horizontal-relative:text;mso-position-vertical:absolute;mso-position-vertical-relative:text;mso-width-percent:0;mso-height-percent:0;mso-width-relative:page;mso-height-relative:page;v-text-anchor:top" o:gfxdata="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">
+              <v:oval w14:anchorId="1FA65CF9" id="Oval 23" o:spid="_x0000_s1033" style="position:absolute;margin-left:80.75pt;margin-top:9.15pt;width:63.55pt;height:28.65pt;z-index:251672576;visibility:visible;mso-wrap-style:square;mso-width-percent:0;mso-height-percent:0;mso-wrap-distance-left:9pt;mso-wrap-distance-top:0;mso-wrap-distance-right:9pt;mso-wrap-distance-bottom:0;mso-position-horizontal:absolute;mso-position-horizontal-relative:text;mso-position-vertical:absolute;mso-position-vertical-relative:text;mso-width-percent:0;mso-height-percent:0;mso-width-relative:page;mso-height-relative:page;v-text-anchor:top" o:gfxdata="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">
                 <v:textbox>
                   <w:txbxContent>
                     <w:p>
@@ -2903,7 +2749,7 @@
         <mc:AlternateContent>
           <mc:Choice Requires="wps">
             <w:drawing>
-              <wp:anchor distT="0" distB="0" distL="114300" distR="114300" simplePos="0" relativeHeight="251453440" behindDoc="0" locked="0" layoutInCell="1" allowOverlap="1" wp14:anchorId="1FA65CF9" wp14:editId="2FC36886">
+              <wp:anchor distT="0" distB="0" distL="114300" distR="114300" simplePos="0" relativeHeight="251677696" behindDoc="0" locked="0" layoutInCell="1" allowOverlap="1" wp14:anchorId="1FA65CF9" wp14:editId="2FC36886">
                 <wp:simplePos x="0" y="0"/>
                 <wp:positionH relativeFrom="column">
                   <wp:posOffset>5173980</wp:posOffset>
@@ -2990,7 +2836,7 @@
           </mc:Choice>
           <mc:Fallback>
             <w:pict>
-              <v:oval w14:anchorId="1FA65CF9" id="Oval 28" o:spid="_x0000_s1034" style="position:absolute;margin-left:407.4pt;margin-top:11.55pt;width:100.8pt;height:31.2pt;z-index:251453440;visibility:visible;mso-wrap-style:square;mso-width-percent:0;mso-height-percent:0;mso-wrap-distance-left:9pt;mso-wrap-distance-top:0;mso-wrap-distance-right:9pt;mso-wrap-distance-bottom:0;mso-position-horizontal:absolute;mso-position-horizontal-relative:text;mso-position-vertical:absolute;mso-position-vertical-relative:text;mso-width-percent:0;mso-height-percent:0;mso-width-relative:page;mso-height-relative:page;v-text-anchor:top" o:gfxdata="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">
+              <v:oval w14:anchorId="1FA65CF9" id="Oval 28" o:spid="_x0000_s1034" style="position:absolute;margin-left:407.4pt;margin-top:11.55pt;width:100.8pt;height:31.2pt;z-index:251677696;visibility:visible;mso-wrap-style:square;mso-width-percent:0;mso-height-percent:0;mso-wrap-distance-left:9pt;mso-wrap-distance-top:0;mso-wrap-distance-right:9pt;mso-wrap-distance-bottom:0;mso-position-horizontal:absolute;mso-position-horizontal-relative:text;mso-position-vertical:absolute;mso-position-vertical-relative:text;mso-width-percent:0;mso-height-percent:0;mso-width-relative:page;mso-height-relative:page;v-text-anchor:top" o:gfxdata="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">
                 <v:textbox>
                   <w:txbxContent>
                     <w:p>
@@ -3033,7 +2879,7 @@
         <mc:AlternateContent>
           <mc:Choice Requires="wps">
             <w:drawing>
-              <wp:anchor distT="0" distB="0" distL="114300" distR="114300" simplePos="0" relativeHeight="251383808" behindDoc="0" locked="0" layoutInCell="1" allowOverlap="1" wp14:anchorId="1FA65CF9" wp14:editId="0E8F90B2">
+              <wp:anchor distT="0" distB="0" distL="114300" distR="114300" simplePos="0" relativeHeight="251673600" behindDoc="0" locked="0" layoutInCell="1" allowOverlap="1" wp14:anchorId="1FA65CF9" wp14:editId="0E8F90B2">
                 <wp:simplePos x="0" y="0"/>
                 <wp:positionH relativeFrom="column">
                   <wp:posOffset>1417320</wp:posOffset>
@@ -3108,7 +2954,7 @@
           </mc:Choice>
           <mc:Fallback>
             <w:pict>
-              <v:oval w14:anchorId="1FA65CF9" id="Oval 24" o:spid="_x0000_s1035" style="position:absolute;margin-left:111.6pt;margin-top:15.15pt;width:60pt;height:30.6pt;z-index:251383808;visibility:visible;mso-wrap-style:square;mso-width-percent:0;mso-height-percent:0;mso-wrap-distance-left:9pt;mso-wrap-distance-top:0;mso-wrap-distance-right:9pt;mso-wrap-distance-bottom:0;mso-position-horizontal:absolute;mso-position-horizontal-relative:text;mso-position-vertical:absolute;mso-position-vertical-relative:text;mso-width-percent:0;mso-height-percent:0;mso-width-relative:page;mso-height-relative:page;v-text-anchor:top" o:gfxdata="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">
+              <v:oval w14:anchorId="1FA65CF9" id="Oval 24" o:spid="_x0000_s1035" style="position:absolute;margin-left:111.6pt;margin-top:15.15pt;width:60pt;height:30.6pt;z-index:251673600;visibility:visible;mso-wrap-style:square;mso-width-percent:0;mso-height-percent:0;mso-wrap-distance-left:9pt;mso-wrap-distance-top:0;mso-wrap-distance-right:9pt;mso-wrap-distance-bottom:0;mso-position-horizontal:absolute;mso-position-horizontal-relative:text;mso-position-vertical:absolute;mso-position-vertical-relative:text;mso-width-percent:0;mso-height-percent:0;mso-width-relative:page;mso-height-relative:page;v-text-anchor:top" o:gfxdata="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">
                 <v:textbox>
                   <w:txbxContent>
                     <w:p>
@@ -3143,7 +2989,7 @@
         <mc:AlternateContent>
           <mc:Choice Requires="wps">
             <w:drawing>
-              <wp:anchor distT="0" distB="0" distL="114300" distR="114300" simplePos="0" relativeHeight="251852800" behindDoc="0" locked="0" layoutInCell="1" allowOverlap="1" wp14:anchorId="741F93BB" wp14:editId="427070E4">
+              <wp:anchor distT="0" distB="0" distL="114300" distR="114300" simplePos="0" relativeHeight="251699200" behindDoc="0" locked="0" layoutInCell="1" allowOverlap="1" wp14:anchorId="741F93BB" wp14:editId="427070E4">
                 <wp:simplePos x="0" y="0"/>
                 <wp:positionH relativeFrom="column">
                   <wp:posOffset>304800</wp:posOffset>
@@ -3204,7 +3050,7 @@
           </mc:Choice>
           <mc:Fallback>
             <w:pict>
-              <v:shape w14:anchorId="0B7443C2" id="AutoShape 52" o:spid="_x0000_s1026" type="#_x0000_t32" style="position:absolute;margin-left:24pt;margin-top:13.7pt;width:50.4pt;height:61.5pt;z-index:251852800;visibility:visible;mso-wrap-style:square;mso-width-percent:0;mso-height-percent:0;mso-wrap-distance-left:9pt;mso-wrap-distance-top:0;mso-wrap-distance-right:9pt;mso-wrap-distance-bottom:0;mso-position-horizontal:absolute;mso-position-horizontal-relative:text;mso-position-vertical:absolute;mso-position-vertical-relative:text;mso-width-percent:0;mso-height-percent:0;mso-width-relative:page;mso-height-relative:page" o:gfxdata="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"/>
+              <v:shape w14:anchorId="1F92B191" id="AutoShape 52" o:spid="_x0000_s1026" type="#_x0000_t32" style="position:absolute;margin-left:24pt;margin-top:13.7pt;width:50.4pt;height:61.5pt;z-index:251699200;visibility:visible;mso-wrap-style:square;mso-width-percent:0;mso-height-percent:0;mso-wrap-distance-left:9pt;mso-wrap-distance-top:0;mso-wrap-distance-right:9pt;mso-wrap-distance-bottom:0;mso-position-horizontal:absolute;mso-position-horizontal-relative:text;mso-position-vertical:absolute;mso-position-vertical-relative:text;mso-width-percent:0;mso-height-percent:0;mso-width-relative:page;mso-height-relative:page" o:gfxdata="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"/>
             </w:pict>
           </mc:Fallback>
         </mc:AlternateContent>
@@ -3217,7 +3063,7 @@
         <mc:AlternateContent>
           <mc:Choice Requires="wps">
             <w:drawing>
-              <wp:anchor distT="0" distB="0" distL="114300" distR="114300" simplePos="0" relativeHeight="251232256" behindDoc="0" locked="0" layoutInCell="1" allowOverlap="1" wp14:anchorId="2DAA374B" wp14:editId="276A197B">
+              <wp:anchor distT="0" distB="0" distL="114300" distR="114300" simplePos="0" relativeHeight="251660288" behindDoc="0" locked="0" layoutInCell="1" allowOverlap="1" wp14:anchorId="2DAA374B" wp14:editId="276A197B">
                 <wp:simplePos x="0" y="0"/>
                 <wp:positionH relativeFrom="column">
                   <wp:posOffset>5153660</wp:posOffset>
@@ -3320,7 +3166,7 @@
           </mc:Choice>
           <mc:Fallback>
             <w:pict>
-              <v:rect w14:anchorId="2DAA374B" id="Rectangle 5" o:spid="_x0000_s1036" style="position:absolute;margin-left:405.8pt;margin-top:16pt;width:77.8pt;height:31.2pt;z-index:251232256;visibility:visible;mso-wrap-style:square;mso-width-percent:0;mso-height-percent:0;mso-wrap-distance-left:9pt;mso-wrap-distance-top:0;mso-wrap-distance-right:9pt;mso-wrap-distance-bottom:0;mso-position-horizontal:absolute;mso-position-horizontal-relative:text;mso-position-vertical:absolute;mso-position-vertical-relative:text;mso-width-percent:0;mso-height-percent:0;mso-width-relative:page;mso-height-relative:page;v-text-anchor:top" o:gfxdata="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">
+              <v:rect w14:anchorId="2DAA374B" id="Rectangle 5" o:spid="_x0000_s1036" style="position:absolute;margin-left:405.8pt;margin-top:16pt;width:77.8pt;height:31.2pt;z-index:251660288;visibility:visible;mso-wrap-style:square;mso-width-percent:0;mso-height-percent:0;mso-wrap-distance-left:9pt;mso-wrap-distance-top:0;mso-wrap-distance-right:9pt;mso-wrap-distance-bottom:0;mso-position-horizontal:absolute;mso-position-horizontal-relative:text;mso-position-vertical:absolute;mso-position-vertical-relative:text;mso-width-percent:0;mso-height-percent:0;mso-width-relative:page;mso-height-relative:page;v-text-anchor:top" o:gfxdata="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">
                 <v:textbox>
                   <w:txbxContent>
                     <w:p>
@@ -3394,13 +3240,13 @@
         <mc:AlternateContent>
           <mc:Choice Requires="wps">
             <w:drawing>
-              <wp:anchor distT="0" distB="0" distL="114300" distR="114300" simplePos="0" relativeHeight="251668480" behindDoc="0" locked="0" layoutInCell="1" allowOverlap="1" wp14:anchorId="5870AF60" wp14:editId="45D87D7C">
+              <wp:anchor distT="0" distB="0" distL="114300" distR="114300" simplePos="0" relativeHeight="251689984" behindDoc="0" locked="0" layoutInCell="1" allowOverlap="1" wp14:anchorId="5870AF60" wp14:editId="777AE069">
                 <wp:simplePos x="0" y="0"/>
                 <wp:positionH relativeFrom="column">
-                  <wp:posOffset>4088130</wp:posOffset>
+                  <wp:posOffset>4674870</wp:posOffset>
                 </wp:positionH>
                 <wp:positionV relativeFrom="paragraph">
-                  <wp:posOffset>27940</wp:posOffset>
+                  <wp:posOffset>285115</wp:posOffset>
                 </wp:positionV>
                 <wp:extent cx="1306195" cy="483235"/>
                 <wp:effectExtent l="19050" t="19050" r="27305" b="31115"/>
@@ -3473,7 +3319,7 @@
                 <v:stroke joinstyle="miter"/>
                 <v:path gradientshapeok="t" o:connecttype="rect" textboxrect="5400,5400,16200,16200"/>
               </v:shapetype>
-              <v:shape id="AutoShape 41" o:spid="_x0000_s1037" type="#_x0000_t4" style="position:absolute;margin-left:321.9pt;margin-top:2.2pt;width:102.85pt;height:38.05pt;z-index:251668480;visibility:visible;mso-wrap-style:square;mso-width-percent:0;mso-height-percent:0;mso-wrap-distance-left:9pt;mso-wrap-distance-top:0;mso-wrap-distance-right:9pt;mso-wrap-distance-bottom:0;mso-position-horizontal:absolute;mso-position-horizontal-relative:text;mso-position-vertical:absolute;mso-position-vertical-relative:text;mso-width-percent:0;mso-height-percent:0;mso-width-relative:page;mso-height-relative:page;v-text-anchor:top" o:gfxdata="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">
+              <v:shape id="AutoShape 41" o:spid="_x0000_s1037" type="#_x0000_t4" style="position:absolute;margin-left:368.1pt;margin-top:22.45pt;width:102.85pt;height:38.05pt;z-index:251689984;visibility:visible;mso-wrap-style:square;mso-width-percent:0;mso-height-percent:0;mso-wrap-distance-left:9pt;mso-wrap-distance-top:0;mso-wrap-distance-right:9pt;mso-wrap-distance-bottom:0;mso-position-horizontal:absolute;mso-position-horizontal-relative:text;mso-position-vertical:absolute;mso-position-vertical-relative:text;mso-width-percent:0;mso-height-percent:0;mso-width-relative:page;mso-height-relative:page;v-text-anchor:top" o:gfxdata="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">
                 <v:textbox>
                   <w:txbxContent>
                     <w:p>
@@ -3504,7 +3350,7 @@
         <mc:AlternateContent>
           <mc:Choice Requires="wps">
             <w:drawing>
-              <wp:anchor distT="0" distB="0" distL="114300" distR="114300" simplePos="0" relativeHeight="251635712" behindDoc="0" locked="0" layoutInCell="1" allowOverlap="1" wp14:anchorId="5870AF60" wp14:editId="35DCE7A0">
+              <wp:anchor distT="0" distB="0" distL="114300" distR="114300" simplePos="0" relativeHeight="251688960" behindDoc="0" locked="0" layoutInCell="1" allowOverlap="1" wp14:anchorId="5870AF60" wp14:editId="35DCE7A0">
                 <wp:simplePos x="0" y="0"/>
                 <wp:positionH relativeFrom="column">
                   <wp:posOffset>937260</wp:posOffset>
@@ -3579,7 +3425,7 @@
           </mc:Choice>
           <mc:Fallback>
             <w:pict>
-              <v:shape w14:anchorId="5870AF60" id="AutoShape 40" o:spid="_x0000_s1038" type="#_x0000_t4" style="position:absolute;margin-left:73.8pt;margin-top:9.5pt;width:127.45pt;height:45.6pt;z-index:251635712;visibility:visible;mso-wrap-style:square;mso-width-percent:0;mso-height-percent:0;mso-wrap-distance-left:9pt;mso-wrap-distance-top:0;mso-wrap-distance-right:9pt;mso-wrap-distance-bottom:0;mso-position-horizontal:absolute;mso-position-horizontal-relative:text;mso-position-vertical:absolute;mso-position-vertical-relative:text;mso-width-percent:0;mso-height-percent:0;mso-width-relative:page;mso-height-relative:page;v-text-anchor:top" o:gfxdata="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">
+              <v:shape w14:anchorId="5870AF60" id="AutoShape 40" o:spid="_x0000_s1038" type="#_x0000_t4" style="position:absolute;margin-left:73.8pt;margin-top:9.5pt;width:127.45pt;height:45.6pt;z-index:251688960;visibility:visible;mso-wrap-style:square;mso-width-percent:0;mso-height-percent:0;mso-wrap-distance-left:9pt;mso-wrap-distance-top:0;mso-wrap-distance-right:9pt;mso-wrap-distance-bottom:0;mso-position-horizontal:absolute;mso-position-horizontal-relative:text;mso-position-vertical:absolute;mso-position-vertical-relative:text;mso-width-percent:0;mso-height-percent:0;mso-width-relative:page;mso-height-relative:page;v-text-anchor:top" o:gfxdata="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">
                 <v:textbox>
                   <w:txbxContent>
                     <w:p>
@@ -3618,8 +3464,84 @@
         </w:tabs>
       </w:pPr>
       <w:r>
+        <w:rPr>
+          <w:noProof/>
+        </w:rPr>
+        <mc:AlternateContent>
+          <mc:Choice Requires="wps">
+            <w:drawing>
+              <wp:anchor distT="0" distB="0" distL="114300" distR="114300" simplePos="0" relativeHeight="251719680" behindDoc="0" locked="0" layoutInCell="1" allowOverlap="1" wp14:anchorId="579076FD" wp14:editId="04B11A19">
+                <wp:simplePos x="0" y="0"/>
+                <wp:positionH relativeFrom="column">
+                  <wp:posOffset>3931920</wp:posOffset>
+                </wp:positionH>
+                <wp:positionV relativeFrom="paragraph">
+                  <wp:posOffset>247015</wp:posOffset>
+                </wp:positionV>
+                <wp:extent cx="754380" cy="788670"/>
+                <wp:effectExtent l="0" t="0" r="26670" b="30480"/>
+                <wp:wrapNone/>
+                <wp:docPr id="408711302" name="Straight Connector 53"/>
+                <wp:cNvGraphicFramePr/>
+                <a:graphic xmlns:a="http://schemas.openxmlformats.org/drawingml/2006/main">
+                  <a:graphicData uri="http://schemas.microsoft.com/office/word/2010/wordprocessingShape">
+                    <wps:wsp>
+                      <wps:cNvCnPr/>
+                      <wps:spPr>
+                        <a:xfrm flipH="1">
+                          <a:off x="0" y="0"/>
+                          <a:ext cx="754380" cy="788670"/>
+                        </a:xfrm>
+                        <a:prstGeom prst="line">
+                          <a:avLst/>
+                        </a:prstGeom>
+                        <a:ln>
+                          <a:solidFill>
+                            <a:schemeClr val="tx1">
+                              <a:lumMod val="95000"/>
+                              <a:lumOff val="5000"/>
+                            </a:schemeClr>
+                          </a:solidFill>
+                        </a:ln>
+                      </wps:spPr>
+                      <wps:style>
+                        <a:lnRef idx="1">
+                          <a:schemeClr val="accent1"/>
+                        </a:lnRef>
+                        <a:fillRef idx="0">
+                          <a:schemeClr val="accent1"/>
+                        </a:fillRef>
+                        <a:effectRef idx="0">
+                          <a:schemeClr val="accent1"/>
+                        </a:effectRef>
+                        <a:fontRef idx="minor">
+                          <a:schemeClr val="tx1"/>
+                        </a:fontRef>
+                      </wps:style>
+                      <wps:bodyPr/>
+                    </wps:wsp>
+                  </a:graphicData>
+                </a:graphic>
+                <wp14:sizeRelH relativeFrom="margin">
+                  <wp14:pctWidth>0</wp14:pctWidth>
+                </wp14:sizeRelH>
+                <wp14:sizeRelV relativeFrom="margin">
+                  <wp14:pctHeight>0</wp14:pctHeight>
+                </wp14:sizeRelV>
+              </wp:anchor>
+            </w:drawing>
+          </mc:Choice>
+          <mc:Fallback>
+            <w:pict>
+              <v:line w14:anchorId="1AF6CFE4" id="Straight Connector 53" o:spid="_x0000_s1026" style="position:absolute;flip:x;z-index:251719680;visibility:visible;mso-wrap-style:square;mso-width-percent:0;mso-height-percent:0;mso-wrap-distance-left:9pt;mso-wrap-distance-top:0;mso-wrap-distance-right:9pt;mso-wrap-distance-bottom:0;mso-position-horizontal:absolute;mso-position-horizontal-relative:text;mso-position-vertical:absolute;mso-position-vertical-relative:text;mso-width-percent:0;mso-height-percent:0;mso-width-relative:margin;mso-height-relative:margin" from="309.6pt,19.45pt" to="369pt,81.55pt" o:gfxdata="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" strokecolor="#0d0d0d [3069]" strokeweight=".5pt">
+                <v:stroke joinstyle="miter"/>
+              </v:line>
+            </w:pict>
+          </mc:Fallback>
+        </mc:AlternateContent>
+      </w:r>
+      <w:r>
         <w:tab/>
-        <w:t>N</w:t>
       </w:r>
     </w:p>
     <w:p/>
@@ -3627,6 +3549,7 @@
       <w:pPr>
         <w:tabs>
           <w:tab w:val="left" w:pos="3864"/>
+          <w:tab w:val="left" w:pos="6516"/>
         </w:tabs>
       </w:pPr>
       <w:r>
@@ -3637,7 +3560,7 @@
         <mc:AlternateContent>
           <mc:Choice Requires="wps">
             <w:drawing>
-              <wp:anchor distT="0" distB="0" distL="114300" distR="114300" simplePos="0" relativeHeight="251496448" behindDoc="0" locked="0" layoutInCell="1" allowOverlap="1" wp14:anchorId="1FA65CF9" wp14:editId="1C7E68E1">
+              <wp:anchor distT="0" distB="0" distL="114300" distR="114300" simplePos="0" relativeHeight="251680768" behindDoc="0" locked="0" layoutInCell="1" allowOverlap="1" wp14:anchorId="1FA65CF9" wp14:editId="1C7E68E1">
                 <wp:simplePos x="0" y="0"/>
                 <wp:positionH relativeFrom="column">
                   <wp:posOffset>4784090</wp:posOffset>
@@ -3712,7 +3635,7 @@
           </mc:Choice>
           <mc:Fallback>
             <w:pict>
-              <v:oval w14:anchorId="1FA65CF9" id="Oval 31" o:spid="_x0000_s1039" style="position:absolute;margin-left:376.7pt;margin-top:9.25pt;width:79.15pt;height:28.65pt;z-index:251496448;visibility:visible;mso-wrap-style:square;mso-width-percent:0;mso-height-percent:0;mso-wrap-distance-left:9pt;mso-wrap-distance-top:0;mso-wrap-distance-right:9pt;mso-wrap-distance-bottom:0;mso-position-horizontal:absolute;mso-position-horizontal-relative:text;mso-position-vertical:absolute;mso-position-vertical-relative:text;mso-width-percent:0;mso-height-percent:0;mso-width-relative:page;mso-height-relative:page;v-text-anchor:top" o:gfxdata="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">
+              <v:oval w14:anchorId="1FA65CF9" id="Oval 31" o:spid="_x0000_s1039" style="position:absolute;margin-left:376.7pt;margin-top:9.25pt;width:79.15pt;height:28.65pt;z-index:251680768;visibility:visible;mso-wrap-style:square;mso-width-percent:0;mso-height-percent:0;mso-wrap-distance-left:9pt;mso-wrap-distance-top:0;mso-wrap-distance-right:9pt;mso-wrap-distance-bottom:0;mso-position-horizontal:absolute;mso-position-horizontal-relative:text;mso-position-vertical:absolute;mso-position-vertical-relative:text;mso-width-percent:0;mso-height-percent:0;mso-width-relative:page;mso-height-relative:page;v-text-anchor:top" o:gfxdata="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">
                 <v:textbox>
                   <w:txbxContent>
                     <w:p>
@@ -3743,7 +3666,7 @@
         <mc:AlternateContent>
           <mc:Choice Requires="wps">
             <w:drawing>
-              <wp:anchor distT="0" distB="0" distL="114300" distR="114300" simplePos="0" relativeHeight="251551744" behindDoc="0" locked="0" layoutInCell="1" allowOverlap="1" wp14:anchorId="1FA65CF9" wp14:editId="0548B601">
+              <wp:anchor distT="0" distB="0" distL="114300" distR="114300" simplePos="0" relativeHeight="251682816" behindDoc="0" locked="0" layoutInCell="1" allowOverlap="1" wp14:anchorId="1FA65CF9" wp14:editId="0548B601">
                 <wp:simplePos x="0" y="0"/>
                 <wp:positionH relativeFrom="column">
                   <wp:posOffset>1327785</wp:posOffset>
@@ -3818,7 +3741,7 @@
           </mc:Choice>
           <mc:Fallback>
             <w:pict>
-              <v:oval w14:anchorId="1FA65CF9" id="Oval 33" o:spid="_x0000_s1040" style="position:absolute;margin-left:104.55pt;margin-top:6.85pt;width:59.25pt;height:31.65pt;z-index:251551744;visibility:visible;mso-wrap-style:square;mso-width-percent:0;mso-height-percent:0;mso-wrap-distance-left:9pt;mso-wrap-distance-top:0;mso-wrap-distance-right:9pt;mso-wrap-distance-bottom:0;mso-position-horizontal:absolute;mso-position-horizontal-relative:text;mso-position-vertical:absolute;mso-position-vertical-relative:text;mso-width-percent:0;mso-height-percent:0;mso-width-relative:page;mso-height-relative:page;v-text-anchor:top" o:gfxdata="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">
+              <v:oval w14:anchorId="1FA65CF9" id="Oval 33" o:spid="_x0000_s1040" style="position:absolute;margin-left:104.55pt;margin-top:6.85pt;width:59.25pt;height:31.65pt;z-index:251682816;visibility:visible;mso-wrap-style:square;mso-width-percent:0;mso-height-percent:0;mso-wrap-distance-left:9pt;mso-wrap-distance-top:0;mso-wrap-distance-right:9pt;mso-wrap-distance-bottom:0;mso-position-horizontal:absolute;mso-position-horizontal-relative:text;mso-position-vertical:absolute;mso-position-vertical-relative:text;mso-width-percent:0;mso-height-percent:0;mso-width-relative:page;mso-height-relative:page;v-text-anchor:top" o:gfxdata="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">
                 <v:textbox>
                   <w:txbxContent>
                     <w:p>
@@ -3845,6 +3768,14 @@
         <w:tab/>
         <w:t>N</w:t>
       </w:r>
+      <w:r>
+        <w:tab/>
+      </w:r>
+      <w:proofErr w:type="spellStart"/>
+      <w:r>
+        <w:t>N</w:t>
+      </w:r>
+      <w:proofErr w:type="spellEnd"/>
     </w:p>
     <w:p/>
     <w:p/>
@@ -3857,7 +3788,7 @@
         <mc:AlternateContent>
           <mc:Choice Requires="wps">
             <w:drawing>
-              <wp:anchor distT="0" distB="0" distL="114300" distR="114300" simplePos="0" relativeHeight="251527168" behindDoc="0" locked="0" layoutInCell="1" allowOverlap="1" wp14:anchorId="1FA65CF9" wp14:editId="6A3E6E7D">
+              <wp:anchor distT="0" distB="0" distL="114300" distR="114300" simplePos="0" relativeHeight="251681792" behindDoc="0" locked="0" layoutInCell="1" allowOverlap="1" wp14:anchorId="1FA65CF9" wp14:editId="6A3E6E7D">
                 <wp:simplePos x="0" y="0"/>
                 <wp:positionH relativeFrom="column">
                   <wp:posOffset>4784090</wp:posOffset>
@@ -3934,7 +3865,7 @@
           </mc:Choice>
           <mc:Fallback>
             <w:pict>
-              <v:oval w14:anchorId="1FA65CF9" id="Oval 32" o:spid="_x0000_s1041" style="position:absolute;margin-left:376.7pt;margin-top:14.4pt;width:95.95pt;height:29.55pt;z-index:251527168;visibility:visible;mso-wrap-style:square;mso-width-percent:0;mso-height-percent:0;mso-wrap-distance-left:9pt;mso-wrap-distance-top:0;mso-wrap-distance-right:9pt;mso-wrap-distance-bottom:0;mso-position-horizontal:absolute;mso-position-horizontal-relative:text;mso-position-vertical:absolute;mso-position-vertical-relative:text;mso-width-percent:0;mso-height-percent:0;mso-width-relative:page;mso-height-relative:page;v-text-anchor:top" o:gfxdata="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">
+              <v:oval w14:anchorId="1FA65CF9" id="Oval 32" o:spid="_x0000_s1041" style="position:absolute;margin-left:376.7pt;margin-top:14.4pt;width:95.95pt;height:29.55pt;z-index:251681792;visibility:visible;mso-wrap-style:square;mso-width-percent:0;mso-height-percent:0;mso-wrap-distance-left:9pt;mso-wrap-distance-top:0;mso-wrap-distance-right:9pt;mso-wrap-distance-bottom:0;mso-position-horizontal:absolute;mso-position-horizontal-relative:text;mso-position-vertical:absolute;mso-position-vertical-relative:text;mso-width-percent:0;mso-height-percent:0;mso-width-relative:page;mso-height-relative:page;v-text-anchor:top" o:gfxdata="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">
                 <v:textbox>
                   <w:txbxContent>
                     <w:p>
@@ -3967,7 +3898,7 @@
         <mc:AlternateContent>
           <mc:Choice Requires="wps">
             <w:drawing>
-              <wp:anchor distT="0" distB="0" distL="114300" distR="114300" simplePos="0" relativeHeight="251584512" behindDoc="0" locked="0" layoutInCell="1" allowOverlap="1" wp14:anchorId="1FA65CF9" wp14:editId="57C98833">
+              <wp:anchor distT="0" distB="0" distL="114300" distR="114300" simplePos="0" relativeHeight="251683840" behindDoc="0" locked="0" layoutInCell="1" allowOverlap="1" wp14:anchorId="1FA65CF9" wp14:editId="57C98833">
                 <wp:simplePos x="0" y="0"/>
                 <wp:positionH relativeFrom="column">
                   <wp:posOffset>1080770</wp:posOffset>
@@ -4042,7 +3973,7 @@
           </mc:Choice>
           <mc:Fallback>
             <w:pict>
-              <v:oval w14:anchorId="1FA65CF9" id="Oval 34" o:spid="_x0000_s1042" style="position:absolute;margin-left:85.1pt;margin-top:.6pt;width:79.15pt;height:31.35pt;z-index:251584512;visibility:visible;mso-wrap-style:square;mso-width-percent:0;mso-height-percent:0;mso-wrap-distance-left:9pt;mso-wrap-distance-top:0;mso-wrap-distance-right:9pt;mso-wrap-distance-bottom:0;mso-position-horizontal:absolute;mso-position-horizontal-relative:text;mso-position-vertical:absolute;mso-position-vertical-relative:text;mso-width-percent:0;mso-height-percent:0;mso-width-relative:page;mso-height-relative:page;v-text-anchor:top" o:gfxdata="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">
+              <v:oval w14:anchorId="1FA65CF9" id="Oval 34" o:spid="_x0000_s1042" style="position:absolute;margin-left:85.1pt;margin-top:.6pt;width:79.15pt;height:31.35pt;z-index:251683840;visibility:visible;mso-wrap-style:square;mso-width-percent:0;mso-height-percent:0;mso-wrap-distance-left:9pt;mso-wrap-distance-top:0;mso-wrap-distance-right:9pt;mso-wrap-distance-bottom:0;mso-position-horizontal:absolute;mso-position-horizontal-relative:text;mso-position-vertical:absolute;mso-position-vertical-relative:text;mso-width-percent:0;mso-height-percent:0;mso-width-relative:page;mso-height-relative:page;v-text-anchor:top" o:gfxdata="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">
                 <v:textbox>
                   <w:txbxContent>
                     <w:p>
@@ -4081,7 +4012,7 @@
         <mc:AlternateContent>
           <mc:Choice Requires="wps">
             <w:drawing>
-              <wp:anchor distT="0" distB="0" distL="114300" distR="114300" simplePos="0" relativeHeight="251459584" behindDoc="0" locked="0" layoutInCell="1" allowOverlap="1" wp14:anchorId="1FA65CF9" wp14:editId="3F58B0B9">
+              <wp:anchor distT="0" distB="0" distL="114300" distR="114300" simplePos="0" relativeHeight="251679744" behindDoc="0" locked="0" layoutInCell="1" allowOverlap="1" wp14:anchorId="1FA65CF9" wp14:editId="3F58B0B9">
                 <wp:simplePos x="0" y="0"/>
                 <wp:positionH relativeFrom="column">
                   <wp:posOffset>2985770</wp:posOffset>
@@ -4156,7 +4087,7 @@
           </mc:Choice>
           <mc:Fallback>
             <w:pict>
-              <v:oval w14:anchorId="1FA65CF9" id="Oval 30" o:spid="_x0000_s1043" style="position:absolute;margin-left:235.1pt;margin-top:16.05pt;width:65.95pt;height:29.25pt;z-index:251459584;visibility:visible;mso-wrap-style:square;mso-width-percent:0;mso-height-percent:0;mso-wrap-distance-left:9pt;mso-wrap-distance-top:0;mso-wrap-distance-right:9pt;mso-wrap-distance-bottom:0;mso-position-horizontal:absolute;mso-position-horizontal-relative:text;mso-position-vertical:absolute;mso-position-vertical-relative:text;mso-width-percent:0;mso-height-percent:0;mso-width-relative:page;mso-height-relative:page;v-text-anchor:top" o:gfxdata="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">
+              <v:oval w14:anchorId="1FA65CF9" id="Oval 30" o:spid="_x0000_s1043" style="position:absolute;margin-left:235.1pt;margin-top:16.05pt;width:65.95pt;height:29.25pt;z-index:251679744;visibility:visible;mso-wrap-style:square;mso-width-percent:0;mso-height-percent:0;mso-wrap-distance-left:9pt;mso-wrap-distance-top:0;mso-wrap-distance-right:9pt;mso-wrap-distance-bottom:0;mso-position-horizontal:absolute;mso-position-horizontal-relative:text;mso-position-vertical:absolute;mso-position-vertical-relative:text;mso-width-percent:0;mso-height-percent:0;mso-width-relative:page;mso-height-relative:page;v-text-anchor:top" o:gfxdata="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">
                 <v:textbox>
                   <w:txbxContent>
                     <w:p>
@@ -4201,7 +4132,7 @@
         <mc:AlternateContent>
           <mc:Choice Requires="wps">
             <w:drawing>
-              <wp:anchor distT="0" distB="0" distL="114300" distR="114300" simplePos="0" relativeHeight="251717632" behindDoc="0" locked="0" layoutInCell="1" allowOverlap="1" wp14:anchorId="5870AF60" wp14:editId="67A8889A">
+              <wp:anchor distT="0" distB="0" distL="114300" distR="114300" simplePos="0" relativeHeight="251692032" behindDoc="0" locked="0" layoutInCell="1" allowOverlap="1" wp14:anchorId="5870AF60" wp14:editId="67A8889A">
                 <wp:simplePos x="0" y="0"/>
                 <wp:positionH relativeFrom="column">
                   <wp:posOffset>3845560</wp:posOffset>
@@ -4282,7 +4213,7 @@
           </mc:Choice>
           <mc:Fallback>
             <w:pict>
-              <v:shape w14:anchorId="5870AF60" id="AutoShape 43" o:spid="_x0000_s1044" type="#_x0000_t4" style="position:absolute;margin-left:302.8pt;margin-top:2.7pt;width:154.45pt;height:38.7pt;z-index:251717632;visibility:visible;mso-wrap-style:square;mso-width-percent:0;mso-height-percent:0;mso-wrap-distance-left:9pt;mso-wrap-distance-top:0;mso-wrap-distance-right:9pt;mso-wrap-distance-bottom:0;mso-position-horizontal:absolute;mso-position-horizontal-relative:text;mso-position-vertical:absolute;mso-position-vertical-relative:text;mso-width-percent:0;mso-height-percent:0;mso-width-relative:page;mso-height-relative:page;v-text-anchor:top" o:gfxdata="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">
+              <v:shape w14:anchorId="5870AF60" id="AutoShape 43" o:spid="_x0000_s1044" type="#_x0000_t4" style="position:absolute;margin-left:302.8pt;margin-top:2.7pt;width:154.45pt;height:38.7pt;z-index:251692032;visibility:visible;mso-wrap-style:square;mso-width-percent:0;mso-height-percent:0;mso-wrap-distance-left:9pt;mso-wrap-distance-top:0;mso-wrap-distance-right:9pt;mso-wrap-distance-bottom:0;mso-position-horizontal:absolute;mso-position-horizontal-relative:text;mso-position-vertical:absolute;mso-position-vertical-relative:text;mso-width-percent:0;mso-height-percent:0;mso-width-relative:page;mso-height-relative:page;v-text-anchor:top" o:gfxdata="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">
                 <v:textbox>
                   <w:txbxContent>
                     <w:p>
@@ -4319,7 +4250,7 @@
         <mc:AlternateContent>
           <mc:Choice Requires="wps">
             <w:drawing>
-              <wp:anchor distT="0" distB="0" distL="114300" distR="114300" simplePos="0" relativeHeight="251398144" behindDoc="0" locked="0" layoutInCell="1" allowOverlap="1" wp14:anchorId="1FA65CF9" wp14:editId="166E64BE">
+              <wp:anchor distT="0" distB="0" distL="114300" distR="114300" simplePos="0" relativeHeight="251674624" behindDoc="0" locked="0" layoutInCell="1" allowOverlap="1" wp14:anchorId="1FA65CF9" wp14:editId="166E64BE">
                 <wp:simplePos x="0" y="0"/>
                 <wp:positionH relativeFrom="column">
                   <wp:posOffset>-243840</wp:posOffset>
@@ -4398,7 +4329,7 @@
           </mc:Choice>
           <mc:Fallback>
             <w:pict>
-              <v:oval w14:anchorId="1FA65CF9" id="Oval 25" o:spid="_x0000_s1045" style="position:absolute;margin-left:-19.2pt;margin-top:5.4pt;width:87.1pt;height:37.2pt;z-index:251398144;visibility:visible;mso-wrap-style:square;mso-width-percent:0;mso-height-percent:0;mso-wrap-distance-left:9pt;mso-wrap-distance-top:0;mso-wrap-distance-right:9pt;mso-wrap-distance-bottom:0;mso-position-horizontal:absolute;mso-position-horizontal-relative:text;mso-position-vertical:absolute;mso-position-vertical-relative:text;mso-width-percent:0;mso-height-percent:0;mso-width-relative:page;mso-height-relative:page;v-text-anchor:top" o:gfxdata="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">
+              <v:oval w14:anchorId="1FA65CF9" id="Oval 25" o:spid="_x0000_s1045" style="position:absolute;margin-left:-19.2pt;margin-top:5.4pt;width:87.1pt;height:37.2pt;z-index:251674624;visibility:visible;mso-wrap-style:square;mso-width-percent:0;mso-height-percent:0;mso-wrap-distance-left:9pt;mso-wrap-distance-top:0;mso-wrap-distance-right:9pt;mso-wrap-distance-bottom:0;mso-position-horizontal:absolute;mso-position-horizontal-relative:text;mso-position-vertical:absolute;mso-position-vertical-relative:text;mso-width-percent:0;mso-height-percent:0;mso-width-relative:page;mso-height-relative:page;v-text-anchor:top" o:gfxdata="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">
                 <v:textbox>
                   <w:txbxContent>
                     <w:p>
@@ -4433,7 +4364,7 @@
         <mc:AlternateContent>
           <mc:Choice Requires="wps">
             <w:drawing>
-              <wp:anchor distT="0" distB="0" distL="114300" distR="114300" simplePos="0" relativeHeight="251697152" behindDoc="0" locked="0" layoutInCell="1" allowOverlap="1" wp14:anchorId="5870AF60" wp14:editId="118F53E0">
+              <wp:anchor distT="0" distB="0" distL="114300" distR="114300" simplePos="0" relativeHeight="251691008" behindDoc="0" locked="0" layoutInCell="1" allowOverlap="1" wp14:anchorId="5870AF60" wp14:editId="118F53E0">
                 <wp:simplePos x="0" y="0"/>
                 <wp:positionH relativeFrom="column">
                   <wp:posOffset>1255395</wp:posOffset>
@@ -4508,7 +4439,7 @@
           </mc:Choice>
           <mc:Fallback>
             <w:pict>
-              <v:shape w14:anchorId="5870AF60" id="AutoShape 42" o:spid="_x0000_s1046" type="#_x0000_t4" style="position:absolute;margin-left:98.85pt;margin-top:2.7pt;width:127.45pt;height:37.95pt;z-index:251697152;visibility:visible;mso-wrap-style:square;mso-width-percent:0;mso-height-percent:0;mso-wrap-distance-left:9pt;mso-wrap-distance-top:0;mso-wrap-distance-right:9pt;mso-wrap-distance-bottom:0;mso-position-horizontal:absolute;mso-position-horizontal-relative:text;mso-position-vertical:absolute;mso-position-vertical-relative:text;mso-width-percent:0;mso-height-percent:0;mso-width-relative:page;mso-height-relative:page;v-text-anchor:top" o:gfxdata="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">
+              <v:shape w14:anchorId="5870AF60" id="AutoShape 42" o:spid="_x0000_s1046" type="#_x0000_t4" style="position:absolute;margin-left:98.85pt;margin-top:2.7pt;width:127.45pt;height:37.95pt;z-index:251691008;visibility:visible;mso-wrap-style:square;mso-width-percent:0;mso-height-percent:0;mso-wrap-distance-left:9pt;mso-wrap-distance-top:0;mso-wrap-distance-right:9pt;mso-wrap-distance-bottom:0;mso-position-horizontal:absolute;mso-position-horizontal-relative:text;mso-position-vertical:absolute;mso-position-vertical-relative:text;mso-width-percent:0;mso-height-percent:0;mso-width-relative:page;mso-height-relative:page;v-text-anchor:top" o:gfxdata="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">
                 <v:textbox>
                   <w:txbxContent>
                     <w:p>
@@ -4547,7 +4478,184 @@
         <mc:AlternateContent>
           <mc:Choice Requires="wps">
             <w:drawing>
-              <wp:anchor distT="0" distB="0" distL="114300" distR="114300" simplePos="0" relativeHeight="251602944" behindDoc="0" locked="0" layoutInCell="1" allowOverlap="1" wp14:anchorId="1FA65CF9" wp14:editId="6AC69E4E">
+              <wp:anchor distT="0" distB="0" distL="114300" distR="114300" simplePos="0" relativeHeight="251721728" behindDoc="0" locked="0" layoutInCell="1" allowOverlap="1" wp14:anchorId="2C8AFBEE" wp14:editId="7732DEAF">
+                <wp:simplePos x="0" y="0"/>
+                <wp:positionH relativeFrom="column">
+                  <wp:posOffset>1470660</wp:posOffset>
+                </wp:positionH>
+                <wp:positionV relativeFrom="paragraph">
+                  <wp:posOffset>918210</wp:posOffset>
+                </wp:positionV>
+                <wp:extent cx="586740" cy="361950"/>
+                <wp:effectExtent l="0" t="0" r="22860" b="19050"/>
+                <wp:wrapNone/>
+                <wp:docPr id="862013042" name="Straight Connector 55"/>
+                <wp:cNvGraphicFramePr/>
+                <a:graphic xmlns:a="http://schemas.openxmlformats.org/drawingml/2006/main">
+                  <a:graphicData uri="http://schemas.microsoft.com/office/word/2010/wordprocessingShape">
+                    <wps:wsp>
+                      <wps:cNvCnPr/>
+                      <wps:spPr>
+                        <a:xfrm>
+                          <a:off x="0" y="0"/>
+                          <a:ext cx="586740" cy="361950"/>
+                        </a:xfrm>
+                        <a:prstGeom prst="line">
+                          <a:avLst/>
+                        </a:prstGeom>
+                        <a:ln>
+                          <a:solidFill>
+                            <a:schemeClr val="tx1">
+                              <a:lumMod val="95000"/>
+                              <a:lumOff val="5000"/>
+                            </a:schemeClr>
+                          </a:solidFill>
+                        </a:ln>
+                      </wps:spPr>
+                      <wps:style>
+                        <a:lnRef idx="1">
+                          <a:schemeClr val="accent1"/>
+                        </a:lnRef>
+                        <a:fillRef idx="0">
+                          <a:schemeClr val="accent1"/>
+                        </a:fillRef>
+                        <a:effectRef idx="0">
+                          <a:schemeClr val="accent1"/>
+                        </a:effectRef>
+                        <a:fontRef idx="minor">
+                          <a:schemeClr val="tx1"/>
+                        </a:fontRef>
+                      </wps:style>
+                      <wps:bodyPr/>
+                    </wps:wsp>
+                  </a:graphicData>
+                </a:graphic>
+                <wp14:sizeRelH relativeFrom="margin">
+                  <wp14:pctWidth>0</wp14:pctWidth>
+                </wp14:sizeRelH>
+                <wp14:sizeRelV relativeFrom="margin">
+                  <wp14:pctHeight>0</wp14:pctHeight>
+                </wp14:sizeRelV>
+              </wp:anchor>
+            </w:drawing>
+          </mc:Choice>
+          <mc:Fallback>
+            <w:pict>
+              <v:line w14:anchorId="0D71539C" id="Straight Connector 55" o:spid="_x0000_s1026" style="position:absolute;z-index:251721728;visibility:visible;mso-wrap-style:square;mso-width-percent:0;mso-height-percent:0;mso-wrap-distance-left:9pt;mso-wrap-distance-top:0;mso-wrap-distance-right:9pt;mso-wrap-distance-bottom:0;mso-position-horizontal:absolute;mso-position-horizontal-relative:text;mso-position-vertical:absolute;mso-position-vertical-relative:text;mso-width-percent:0;mso-height-percent:0;mso-width-relative:margin;mso-height-relative:margin" from="115.8pt,72.3pt" to="162pt,100.8pt" o:gfxdata="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" strokecolor="#0d0d0d [3069]" strokeweight=".5pt">
+                <v:stroke joinstyle="miter"/>
+              </v:line>
+            </w:pict>
+          </mc:Fallback>
+        </mc:AlternateContent>
+      </w:r>
+      <w:r>
+        <w:rPr>
+          <w:noProof/>
+          <w:color w:val="FFFFFF" w:themeColor="background1"/>
+        </w:rPr>
+        <mc:AlternateContent>
+          <mc:Choice Requires="wps">
+            <w:drawing>
+              <wp:anchor distT="0" distB="0" distL="114300" distR="114300" simplePos="0" relativeHeight="251720704" behindDoc="0" locked="0" layoutInCell="1" allowOverlap="1" wp14:anchorId="4D9ECF75" wp14:editId="0082846E">
+                <wp:simplePos x="0" y="0"/>
+                <wp:positionH relativeFrom="column">
+                  <wp:posOffset>1303020</wp:posOffset>
+                </wp:positionH>
+                <wp:positionV relativeFrom="paragraph">
+                  <wp:posOffset>1253490</wp:posOffset>
+                </wp:positionV>
+                <wp:extent cx="1143000" cy="457200"/>
+                <wp:effectExtent l="0" t="0" r="19050" b="19050"/>
+                <wp:wrapNone/>
+                <wp:docPr id="1908194948" name="Oval 54"/>
+                <wp:cNvGraphicFramePr/>
+                <a:graphic xmlns:a="http://schemas.openxmlformats.org/drawingml/2006/main">
+                  <a:graphicData uri="http://schemas.microsoft.com/office/word/2010/wordprocessingShape">
+                    <wps:wsp>
+                      <wps:cNvSpPr/>
+                      <wps:spPr>
+                        <a:xfrm>
+                          <a:off x="0" y="0"/>
+                          <a:ext cx="1143000" cy="457200"/>
+                        </a:xfrm>
+                        <a:prstGeom prst="ellipse">
+                          <a:avLst/>
+                        </a:prstGeom>
+                      </wps:spPr>
+                      <wps:style>
+                        <a:lnRef idx="2">
+                          <a:schemeClr val="dk1"/>
+                        </a:lnRef>
+                        <a:fillRef idx="1">
+                          <a:schemeClr val="lt1"/>
+                        </a:fillRef>
+                        <a:effectRef idx="0">
+                          <a:schemeClr val="dk1"/>
+                        </a:effectRef>
+                        <a:fontRef idx="minor">
+                          <a:schemeClr val="dk1"/>
+                        </a:fontRef>
+                      </wps:style>
+                      <wps:txbx>
+                        <w:txbxContent>
+                          <w:p>
+                            <w:pPr>
+                              <w:jc w:val="center"/>
+                            </w:pPr>
+                            <w:r>
+                              <w:t>NOC</w:t>
+                            </w:r>
+                          </w:p>
+                        </w:txbxContent>
+                      </wps:txbx>
+                      <wps:bodyPr rot="0" spcFirstLastPara="0" vertOverflow="overflow" horzOverflow="overflow" vert="horz" wrap="square" lIns="91440" tIns="45720" rIns="91440" bIns="45720" numCol="1" spcCol="0" rtlCol="0" fromWordArt="0" anchor="ctr" anchorCtr="0" forceAA="0" compatLnSpc="1">
+                        <a:prstTxWarp prst="textNoShape">
+                          <a:avLst/>
+                        </a:prstTxWarp>
+                        <a:noAutofit/>
+                      </wps:bodyPr>
+                    </wps:wsp>
+                  </a:graphicData>
+                </a:graphic>
+                <wp14:sizeRelH relativeFrom="margin">
+                  <wp14:pctWidth>0</wp14:pctWidth>
+                </wp14:sizeRelH>
+                <wp14:sizeRelV relativeFrom="margin">
+                  <wp14:pctHeight>0</wp14:pctHeight>
+                </wp14:sizeRelV>
+              </wp:anchor>
+            </w:drawing>
+          </mc:Choice>
+          <mc:Fallback>
+            <w:pict>
+              <v:oval w14:anchorId="4D9ECF75" id="Oval 54" o:spid="_x0000_s1047" style="position:absolute;margin-left:102.6pt;margin-top:98.7pt;width:90pt;height:36pt;z-index:251720704;visibility:visible;mso-wrap-style:square;mso-width-percent:0;mso-height-percent:0;mso-wrap-distance-left:9pt;mso-wrap-distance-top:0;mso-wrap-distance-right:9pt;mso-wrap-distance-bottom:0;mso-position-horizontal:absolute;mso-position-horizontal-relative:text;mso-position-vertical:absolute;mso-position-vertical-relative:text;mso-width-percent:0;mso-height-percent:0;mso-width-relative:margin;mso-height-relative:margin;v-text-anchor:middle" o:gfxdata="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" fillcolor="white [3201]" strokecolor="black [3200]" strokeweight="1pt">
+                <v:stroke joinstyle="miter"/>
+                <v:textbox>
+                  <w:txbxContent>
+                    <w:p>
+                      <w:pPr>
+                        <w:jc w:val="center"/>
+                      </w:pPr>
+                      <w:r>
+                        <w:t>NOC</w:t>
+                      </w:r>
+                    </w:p>
+                  </w:txbxContent>
+                </v:textbox>
+              </v:oval>
+            </w:pict>
+          </mc:Fallback>
+        </mc:AlternateContent>
+      </w:r>
+      <w:r>
+        <w:rPr>
+          <w:noProof/>
+          <w:color w:val="FFFFFF" w:themeColor="background1"/>
+        </w:rPr>
+        <mc:AlternateContent>
+          <mc:Choice Requires="wps">
+            <w:drawing>
+              <wp:anchor distT="0" distB="0" distL="114300" distR="114300" simplePos="0" relativeHeight="251687936" behindDoc="0" locked="0" layoutInCell="1" allowOverlap="1" wp14:anchorId="1FA65CF9" wp14:editId="6AC69E4E">
                 <wp:simplePos x="0" y="0"/>
                 <wp:positionH relativeFrom="column">
                   <wp:posOffset>5678805</wp:posOffset>
@@ -4626,7 +4734,7 @@
           </mc:Choice>
           <mc:Fallback>
             <w:pict>
-              <v:oval w14:anchorId="1FA65CF9" id="Oval 39" o:spid="_x0000_s1047" style="position:absolute;margin-left:447.15pt;margin-top:114.6pt;width:75.8pt;height:33.9pt;z-index:251602944;visibility:visible;mso-wrap-style:square;mso-width-percent:0;mso-height-percent:0;mso-wrap-distance-left:9pt;mso-wrap-distance-top:0;mso-wrap-distance-right:9pt;mso-wrap-distance-bottom:0;mso-position-horizontal:absolute;mso-position-horizontal-relative:text;mso-position-vertical:absolute;mso-position-vertical-relative:text;mso-width-percent:0;mso-height-percent:0;mso-width-relative:page;mso-height-relative:page;v-text-anchor:top" o:gfxdata="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">
+              <v:oval w14:anchorId="1FA65CF9" id="Oval 39" o:spid="_x0000_s1048" style="position:absolute;margin-left:447.15pt;margin-top:114.6pt;width:75.8pt;height:33.9pt;z-index:251687936;visibility:visible;mso-wrap-style:square;mso-width-percent:0;mso-height-percent:0;mso-wrap-distance-left:9pt;mso-wrap-distance-top:0;mso-wrap-distance-right:9pt;mso-wrap-distance-bottom:0;mso-position-horizontal:absolute;mso-position-horizontal-relative:text;mso-position-vertical:absolute;mso-position-vertical-relative:text;mso-width-percent:0;mso-height-percent:0;mso-width-relative:page;mso-height-relative:page;v-text-anchor:top" o:gfxdata="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">
                 <v:textbox>
                   <w:txbxContent>
                     <w:p>
@@ -4661,7 +4769,7 @@
         <mc:AlternateContent>
           <mc:Choice Requires="wps">
             <w:drawing>
-              <wp:anchor distT="0" distB="0" distL="114300" distR="114300" simplePos="0" relativeHeight="251598848" behindDoc="0" locked="0" layoutInCell="1" allowOverlap="1" wp14:anchorId="1FA65CF9" wp14:editId="12ECFF69">
+              <wp:anchor distT="0" distB="0" distL="114300" distR="114300" simplePos="0" relativeHeight="251686912" behindDoc="0" locked="0" layoutInCell="1" allowOverlap="1" wp14:anchorId="1FA65CF9" wp14:editId="12ECFF69">
                 <wp:simplePos x="0" y="0"/>
                 <wp:positionH relativeFrom="column">
                   <wp:posOffset>4998720</wp:posOffset>
@@ -4736,7 +4844,7 @@
           </mc:Choice>
           <mc:Fallback>
             <w:pict>
-              <v:oval w14:anchorId="1FA65CF9" id="Oval 38" o:spid="_x0000_s1048" style="position:absolute;margin-left:393.6pt;margin-top:84.9pt;width:70.8pt;height:34.05pt;z-index:251598848;visibility:visible;mso-wrap-style:square;mso-width-percent:0;mso-height-percent:0;mso-wrap-distance-left:9pt;mso-wrap-distance-top:0;mso-wrap-distance-right:9pt;mso-wrap-distance-bottom:0;mso-position-horizontal:absolute;mso-position-horizontal-relative:text;mso-position-vertical:absolute;mso-position-vertical-relative:text;mso-width-percent:0;mso-height-percent:0;mso-width-relative:page;mso-height-relative:page;v-text-anchor:top" o:gfxdata="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">
+              <v:oval w14:anchorId="1FA65CF9" id="Oval 38" o:spid="_x0000_s1049" style="position:absolute;margin-left:393.6pt;margin-top:84.9pt;width:70.8pt;height:34.05pt;z-index:251686912;visibility:visible;mso-wrap-style:square;mso-width-percent:0;mso-height-percent:0;mso-wrap-distance-left:9pt;mso-wrap-distance-top:0;mso-wrap-distance-right:9pt;mso-wrap-distance-bottom:0;mso-position-horizontal:absolute;mso-position-horizontal-relative:text;mso-position-vertical:absolute;mso-position-vertical-relative:text;mso-width-percent:0;mso-height-percent:0;mso-width-relative:page;mso-height-relative:page;v-text-anchor:top" o:gfxdata="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">
                 <v:textbox>
                   <w:txbxContent>
                     <w:p>
@@ -4767,7 +4875,7 @@
         <mc:AlternateContent>
           <mc:Choice Requires="wps">
             <w:drawing>
-              <wp:anchor distT="0" distB="0" distL="114300" distR="114300" simplePos="0" relativeHeight="251594752" behindDoc="0" locked="0" layoutInCell="1" allowOverlap="1" wp14:anchorId="1FA65CF9" wp14:editId="168A4593">
+              <wp:anchor distT="0" distB="0" distL="114300" distR="114300" simplePos="0" relativeHeight="251685888" behindDoc="0" locked="0" layoutInCell="1" allowOverlap="1" wp14:anchorId="1FA65CF9" wp14:editId="168A4593">
                 <wp:simplePos x="0" y="0"/>
                 <wp:positionH relativeFrom="column">
                   <wp:posOffset>4204335</wp:posOffset>
@@ -4842,7 +4950,7 @@
           </mc:Choice>
           <mc:Fallback>
             <w:pict>
-              <v:oval w14:anchorId="1FA65CF9" id="Oval 37" o:spid="_x0000_s1049" style="position:absolute;margin-left:331.05pt;margin-top:117.15pt;width:58.75pt;height:32.55pt;z-index:251594752;visibility:visible;mso-wrap-style:square;mso-width-percent:0;mso-height-percent:0;mso-wrap-distance-left:9pt;mso-wrap-distance-top:0;mso-wrap-distance-right:9pt;mso-wrap-distance-bottom:0;mso-position-horizontal:absolute;mso-position-horizontal-relative:text;mso-position-vertical:absolute;mso-position-vertical-relative:text;mso-width-percent:0;mso-height-percent:0;mso-width-relative:page;mso-height-relative:page;v-text-anchor:top" o:gfxdata="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">
+              <v:oval w14:anchorId="1FA65CF9" id="Oval 37" o:spid="_x0000_s1050" style="position:absolute;margin-left:331.05pt;margin-top:117.15pt;width:58.75pt;height:32.55pt;z-index:251685888;visibility:visible;mso-wrap-style:square;mso-width-percent:0;mso-height-percent:0;mso-wrap-distance-left:9pt;mso-wrap-distance-top:0;mso-wrap-distance-right:9pt;mso-wrap-distance-bottom:0;mso-position-horizontal:absolute;mso-position-horizontal-relative:text;mso-position-vertical:absolute;mso-position-vertical-relative:text;mso-width-percent:0;mso-height-percent:0;mso-width-relative:page;mso-height-relative:page;v-text-anchor:top" o:gfxdata="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">
                 <v:textbox>
                   <w:txbxContent>
                     <w:p>
@@ -4873,7 +4981,7 @@
         <mc:AlternateContent>
           <mc:Choice Requires="wps">
             <w:drawing>
-              <wp:anchor distT="0" distB="0" distL="114300" distR="114300" simplePos="0" relativeHeight="251588608" behindDoc="0" locked="0" layoutInCell="1" allowOverlap="1" wp14:anchorId="1FA65CF9" wp14:editId="1E807B87">
+              <wp:anchor distT="0" distB="0" distL="114300" distR="114300" simplePos="0" relativeHeight="251684864" behindDoc="0" locked="0" layoutInCell="1" allowOverlap="1" wp14:anchorId="1FA65CF9" wp14:editId="1E807B87">
                 <wp:simplePos x="0" y="0"/>
                 <wp:positionH relativeFrom="column">
                   <wp:posOffset>3864610</wp:posOffset>
@@ -4948,7 +5056,7 @@
           </mc:Choice>
           <mc:Fallback>
             <w:pict>
-              <v:oval w14:anchorId="1FA65CF9" id="Oval 36" o:spid="_x0000_s1050" style="position:absolute;margin-left:304.3pt;margin-top:69.6pt;width:52.15pt;height:31.5pt;z-index:251588608;visibility:visible;mso-wrap-style:square;mso-width-percent:0;mso-height-percent:0;mso-wrap-distance-left:9pt;mso-wrap-distance-top:0;mso-wrap-distance-right:9pt;mso-wrap-distance-bottom:0;mso-position-horizontal:absolute;mso-position-horizontal-relative:text;mso-position-vertical:absolute;mso-position-vertical-relative:text;mso-width-percent:0;mso-height-percent:0;mso-width-relative:page;mso-height-relative:page;v-text-anchor:top" o:gfxdata="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">
+              <v:oval w14:anchorId="1FA65CF9" id="Oval 36" o:spid="_x0000_s1051" style="position:absolute;margin-left:304.3pt;margin-top:69.6pt;width:52.15pt;height:31.5pt;z-index:251684864;visibility:visible;mso-wrap-style:square;mso-width-percent:0;mso-height-percent:0;mso-wrap-distance-left:9pt;mso-wrap-distance-top:0;mso-wrap-distance-right:9pt;mso-wrap-distance-bottom:0;mso-position-horizontal:absolute;mso-position-horizontal-relative:text;mso-position-vertical:absolute;mso-position-vertical-relative:text;mso-width-percent:0;mso-height-percent:0;mso-width-relative:page;mso-height-relative:page;v-text-anchor:top" o:gfxdata="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">
                 <v:textbox>
                   <w:txbxContent>
                     <w:p>
@@ -4979,7 +5087,7 @@
         <mc:AlternateContent>
           <mc:Choice Requires="wps">
             <w:drawing>
-              <wp:anchor distT="0" distB="0" distL="114300" distR="114300" simplePos="0" relativeHeight="251416576" behindDoc="0" locked="0" layoutInCell="1" allowOverlap="1" wp14:anchorId="1FA65CF9" wp14:editId="3E6C305E">
+              <wp:anchor distT="0" distB="0" distL="114300" distR="114300" simplePos="0" relativeHeight="251675648" behindDoc="0" locked="0" layoutInCell="1" allowOverlap="1" wp14:anchorId="1FA65CF9" wp14:editId="3E6C305E">
                 <wp:simplePos x="0" y="0"/>
                 <wp:positionH relativeFrom="column">
                   <wp:posOffset>-266700</wp:posOffset>
@@ -5062,7 +5170,7 @@
           </mc:Choice>
           <mc:Fallback>
             <w:pict>
-              <v:oval w14:anchorId="1FA65CF9" id="Oval 26" o:spid="_x0000_s1051" style="position:absolute;margin-left:-21pt;margin-top:86.7pt;width:114.6pt;height:31.35pt;z-index:251416576;visibility:visible;mso-wrap-style:square;mso-width-percent:0;mso-height-percent:0;mso-wrap-distance-left:9pt;mso-wrap-distance-top:0;mso-wrap-distance-right:9pt;mso-wrap-distance-bottom:0;mso-position-horizontal:absolute;mso-position-horizontal-relative:text;mso-position-vertical:absolute;mso-position-vertical-relative:text;mso-width-percent:0;mso-height-percent:0;mso-width-relative:page;mso-height-relative:page;v-text-anchor:top" o:gfxdata="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">
+              <v:oval w14:anchorId="1FA65CF9" id="Oval 26" o:spid="_x0000_s1052" style="position:absolute;margin-left:-21pt;margin-top:86.7pt;width:114.6pt;height:31.35pt;z-index:251675648;visibility:visible;mso-wrap-style:square;mso-width-percent:0;mso-height-percent:0;mso-wrap-distance-left:9pt;mso-wrap-distance-top:0;mso-wrap-distance-right:9pt;mso-wrap-distance-bottom:0;mso-position-horizontal:absolute;mso-position-horizontal-relative:text;mso-position-vertical:absolute;mso-position-vertical-relative:text;mso-width-percent:0;mso-height-percent:0;mso-width-relative:page;mso-height-relative:page;v-text-anchor:top" o:gfxdata="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">
                 <v:textbox>
                   <w:txbxContent>
                     <w:p>
@@ -5715,6 +5823,7 @@
   <w:style w:type="character" w:default="1" w:styleId="DefaultParagraphFont">
     <w:name w:val="Default Paragraph Font"/>
     <w:uiPriority w:val="1"/>
+    <w:semiHidden/>
     <w:unhideWhenUsed/>
   </w:style>
   <w:style w:type="table" w:default="1" w:styleId="TableNormal">

</xml_diff>